<commit_message>
Add RawItem schema and seed corpus importer
refresher/schemas.py defines RawItem, AuthorHint and Attachment, with
forwarded_by kept apart from author_hint. channels/importer.py turns
eval/seed_corpus/originals plus manifest.yaml into raw/*.json (Telegram
Desktop copies, LinkedIn pastes, plain text, .eml, binary attachments).
Seeds move from sample_raw/; run with uv run refresher-import. The plan
doc records forwarded_by and the corpus status.

Co-Authored-By: Claude Opus 5.5 <noreply@anthropic.com>
</commit_message>
<xml_diff>
--- a/Refresher hackathon plan and team split v2.docx
+++ b/Refresher hackathon plan and team split v2.docx
@@ -14,13 +14,7 @@
     </w:p>
     <w:p>
       <w:r>
-        <w:t>Oct 1</w:t>
-      </w:r>
-      <w:r>
-        <w:t>9</w:t>
-      </w:r>
-      <w:r>
-        <w:t>, 2026 · @Kirill</w:t>
+        <w:t>Oct 19, 2026 · @Kirill</w:t>
       </w:r>
     </w:p>
     <w:sdt>
@@ -90,46 +84,10 @@
                 <w:webHidden/>
               </w:rPr>
               <w:tab/>
-            </w:r>
-            <w:r>
-              <w:rPr>
-                <w:noProof/>
-                <w:webHidden/>
-              </w:rPr>
               <w:fldChar w:fldCharType="begin"/>
-            </w:r>
-            <w:r>
-              <w:rPr>
-                <w:noProof/>
-                <w:webHidden/>
-              </w:rPr>
               <w:instrText xml:space="preserve"> PAGEREF _Toc243303732 \h </w:instrText>
-            </w:r>
-            <w:r>
-              <w:rPr>
-                <w:noProof/>
-                <w:webHidden/>
-              </w:rPr>
-            </w:r>
-            <w:r>
-              <w:rPr>
-                <w:noProof/>
-                <w:webHidden/>
-              </w:rPr>
               <w:fldChar w:fldCharType="separate"/>
-            </w:r>
-            <w:r>
-              <w:rPr>
-                <w:noProof/>
-                <w:webHidden/>
-              </w:rPr>
               <w:t>1</w:t>
-            </w:r>
-            <w:r>
-              <w:rPr>
-                <w:noProof/>
-                <w:webHidden/>
-              </w:rPr>
               <w:fldChar w:fldCharType="end"/>
             </w:r>
           </w:hyperlink>
@@ -158,46 +116,10 @@
                 <w:webHidden/>
               </w:rPr>
               <w:tab/>
-            </w:r>
-            <w:r>
-              <w:rPr>
-                <w:noProof/>
-                <w:webHidden/>
-              </w:rPr>
               <w:fldChar w:fldCharType="begin"/>
-            </w:r>
-            <w:r>
-              <w:rPr>
-                <w:noProof/>
-                <w:webHidden/>
-              </w:rPr>
               <w:instrText xml:space="preserve"> PAGEREF _Toc243303733 \h </w:instrText>
-            </w:r>
-            <w:r>
-              <w:rPr>
-                <w:noProof/>
-                <w:webHidden/>
-              </w:rPr>
-            </w:r>
-            <w:r>
-              <w:rPr>
-                <w:noProof/>
-                <w:webHidden/>
-              </w:rPr>
               <w:fldChar w:fldCharType="separate"/>
-            </w:r>
-            <w:r>
-              <w:rPr>
-                <w:noProof/>
-                <w:webHidden/>
-              </w:rPr>
               <w:t>1</w:t>
-            </w:r>
-            <w:r>
-              <w:rPr>
-                <w:noProof/>
-                <w:webHidden/>
-              </w:rPr>
               <w:fldChar w:fldCharType="end"/>
             </w:r>
           </w:hyperlink>
@@ -226,46 +148,10 @@
                 <w:webHidden/>
               </w:rPr>
               <w:tab/>
-            </w:r>
-            <w:r>
-              <w:rPr>
-                <w:noProof/>
-                <w:webHidden/>
-              </w:rPr>
               <w:fldChar w:fldCharType="begin"/>
-            </w:r>
-            <w:r>
-              <w:rPr>
-                <w:noProof/>
-                <w:webHidden/>
-              </w:rPr>
               <w:instrText xml:space="preserve"> PAGEREF _Toc243303734 \h </w:instrText>
-            </w:r>
-            <w:r>
-              <w:rPr>
-                <w:noProof/>
-                <w:webHidden/>
-              </w:rPr>
-            </w:r>
-            <w:r>
-              <w:rPr>
-                <w:noProof/>
-                <w:webHidden/>
-              </w:rPr>
               <w:fldChar w:fldCharType="separate"/>
-            </w:r>
-            <w:r>
-              <w:rPr>
-                <w:noProof/>
-                <w:webHidden/>
-              </w:rPr>
               <w:t>1</w:t>
-            </w:r>
-            <w:r>
-              <w:rPr>
-                <w:noProof/>
-                <w:webHidden/>
-              </w:rPr>
               <w:fldChar w:fldCharType="end"/>
             </w:r>
           </w:hyperlink>
@@ -294,46 +180,10 @@
                 <w:webHidden/>
               </w:rPr>
               <w:tab/>
-            </w:r>
-            <w:r>
-              <w:rPr>
-                <w:noProof/>
-                <w:webHidden/>
-              </w:rPr>
               <w:fldChar w:fldCharType="begin"/>
-            </w:r>
-            <w:r>
-              <w:rPr>
-                <w:noProof/>
-                <w:webHidden/>
-              </w:rPr>
               <w:instrText xml:space="preserve"> PAGEREF _Toc243303735 \h </w:instrText>
-            </w:r>
-            <w:r>
-              <w:rPr>
-                <w:noProof/>
-                <w:webHidden/>
-              </w:rPr>
-            </w:r>
-            <w:r>
-              <w:rPr>
-                <w:noProof/>
-                <w:webHidden/>
-              </w:rPr>
               <w:fldChar w:fldCharType="separate"/>
-            </w:r>
-            <w:r>
-              <w:rPr>
-                <w:noProof/>
-                <w:webHidden/>
-              </w:rPr>
               <w:t>2</w:t>
-            </w:r>
-            <w:r>
-              <w:rPr>
-                <w:noProof/>
-                <w:webHidden/>
-              </w:rPr>
               <w:fldChar w:fldCharType="end"/>
             </w:r>
           </w:hyperlink>
@@ -362,46 +212,10 @@
                 <w:webHidden/>
               </w:rPr>
               <w:tab/>
-            </w:r>
-            <w:r>
-              <w:rPr>
-                <w:noProof/>
-                <w:webHidden/>
-              </w:rPr>
               <w:fldChar w:fldCharType="begin"/>
-            </w:r>
-            <w:r>
-              <w:rPr>
-                <w:noProof/>
-                <w:webHidden/>
-              </w:rPr>
               <w:instrText xml:space="preserve"> PAGEREF _Toc243303736 \h </w:instrText>
-            </w:r>
-            <w:r>
-              <w:rPr>
-                <w:noProof/>
-                <w:webHidden/>
-              </w:rPr>
-            </w:r>
-            <w:r>
-              <w:rPr>
-                <w:noProof/>
-                <w:webHidden/>
-              </w:rPr>
               <w:fldChar w:fldCharType="separate"/>
-            </w:r>
-            <w:r>
-              <w:rPr>
-                <w:noProof/>
-                <w:webHidden/>
-              </w:rPr>
               <w:t>4</w:t>
-            </w:r>
-            <w:r>
-              <w:rPr>
-                <w:noProof/>
-                <w:webHidden/>
-              </w:rPr>
               <w:fldChar w:fldCharType="end"/>
             </w:r>
           </w:hyperlink>
@@ -430,46 +244,10 @@
                 <w:webHidden/>
               </w:rPr>
               <w:tab/>
-            </w:r>
-            <w:r>
-              <w:rPr>
-                <w:noProof/>
-                <w:webHidden/>
-              </w:rPr>
               <w:fldChar w:fldCharType="begin"/>
-            </w:r>
-            <w:r>
-              <w:rPr>
-                <w:noProof/>
-                <w:webHidden/>
-              </w:rPr>
               <w:instrText xml:space="preserve"> PAGEREF _Toc243303737 \h </w:instrText>
-            </w:r>
-            <w:r>
-              <w:rPr>
-                <w:noProof/>
-                <w:webHidden/>
-              </w:rPr>
-            </w:r>
-            <w:r>
-              <w:rPr>
-                <w:noProof/>
-                <w:webHidden/>
-              </w:rPr>
               <w:fldChar w:fldCharType="separate"/>
-            </w:r>
-            <w:r>
-              <w:rPr>
-                <w:noProof/>
-                <w:webHidden/>
-              </w:rPr>
               <w:t>5</w:t>
-            </w:r>
-            <w:r>
-              <w:rPr>
-                <w:noProof/>
-                <w:webHidden/>
-              </w:rPr>
               <w:fldChar w:fldCharType="end"/>
             </w:r>
           </w:hyperlink>
@@ -498,46 +276,10 @@
                 <w:webHidden/>
               </w:rPr>
               <w:tab/>
-            </w:r>
-            <w:r>
-              <w:rPr>
-                <w:noProof/>
-                <w:webHidden/>
-              </w:rPr>
               <w:fldChar w:fldCharType="begin"/>
-            </w:r>
-            <w:r>
-              <w:rPr>
-                <w:noProof/>
-                <w:webHidden/>
-              </w:rPr>
               <w:instrText xml:space="preserve"> PAGEREF _Toc243303738 \h </w:instrText>
-            </w:r>
-            <w:r>
-              <w:rPr>
-                <w:noProof/>
-                <w:webHidden/>
-              </w:rPr>
-            </w:r>
-            <w:r>
-              <w:rPr>
-                <w:noProof/>
-                <w:webHidden/>
-              </w:rPr>
               <w:fldChar w:fldCharType="separate"/>
-            </w:r>
-            <w:r>
-              <w:rPr>
-                <w:noProof/>
-                <w:webHidden/>
-              </w:rPr>
               <w:t>7</w:t>
-            </w:r>
-            <w:r>
-              <w:rPr>
-                <w:noProof/>
-                <w:webHidden/>
-              </w:rPr>
               <w:fldChar w:fldCharType="end"/>
             </w:r>
           </w:hyperlink>
@@ -566,46 +308,10 @@
                 <w:webHidden/>
               </w:rPr>
               <w:tab/>
-            </w:r>
-            <w:r>
-              <w:rPr>
-                <w:noProof/>
-                <w:webHidden/>
-              </w:rPr>
               <w:fldChar w:fldCharType="begin"/>
-            </w:r>
-            <w:r>
-              <w:rPr>
-                <w:noProof/>
-                <w:webHidden/>
-              </w:rPr>
               <w:instrText xml:space="preserve"> PAGEREF _Toc243303739 \h </w:instrText>
-            </w:r>
-            <w:r>
-              <w:rPr>
-                <w:noProof/>
-                <w:webHidden/>
-              </w:rPr>
-            </w:r>
-            <w:r>
-              <w:rPr>
-                <w:noProof/>
-                <w:webHidden/>
-              </w:rPr>
               <w:fldChar w:fldCharType="separate"/>
-            </w:r>
-            <w:r>
-              <w:rPr>
-                <w:noProof/>
-                <w:webHidden/>
-              </w:rPr>
               <w:t>7</w:t>
-            </w:r>
-            <w:r>
-              <w:rPr>
-                <w:noProof/>
-                <w:webHidden/>
-              </w:rPr>
               <w:fldChar w:fldCharType="end"/>
             </w:r>
           </w:hyperlink>
@@ -634,46 +340,10 @@
                 <w:webHidden/>
               </w:rPr>
               <w:tab/>
-            </w:r>
-            <w:r>
-              <w:rPr>
-                <w:noProof/>
-                <w:webHidden/>
-              </w:rPr>
               <w:fldChar w:fldCharType="begin"/>
-            </w:r>
-            <w:r>
-              <w:rPr>
-                <w:noProof/>
-                <w:webHidden/>
-              </w:rPr>
               <w:instrText xml:space="preserve"> PAGEREF _Toc243303740 \h </w:instrText>
-            </w:r>
-            <w:r>
-              <w:rPr>
-                <w:noProof/>
-                <w:webHidden/>
-              </w:rPr>
-            </w:r>
-            <w:r>
-              <w:rPr>
-                <w:noProof/>
-                <w:webHidden/>
-              </w:rPr>
               <w:fldChar w:fldCharType="separate"/>
-            </w:r>
-            <w:r>
-              <w:rPr>
-                <w:noProof/>
-                <w:webHidden/>
-              </w:rPr>
               <w:t>8</w:t>
-            </w:r>
-            <w:r>
-              <w:rPr>
-                <w:noProof/>
-                <w:webHidden/>
-              </w:rPr>
               <w:fldChar w:fldCharType="end"/>
             </w:r>
           </w:hyperlink>
@@ -702,46 +372,10 @@
                 <w:webHidden/>
               </w:rPr>
               <w:tab/>
-            </w:r>
-            <w:r>
-              <w:rPr>
-                <w:noProof/>
-                <w:webHidden/>
-              </w:rPr>
               <w:fldChar w:fldCharType="begin"/>
-            </w:r>
-            <w:r>
-              <w:rPr>
-                <w:noProof/>
-                <w:webHidden/>
-              </w:rPr>
               <w:instrText xml:space="preserve"> PAGEREF _Toc243303741 \h </w:instrText>
-            </w:r>
-            <w:r>
-              <w:rPr>
-                <w:noProof/>
-                <w:webHidden/>
-              </w:rPr>
-            </w:r>
-            <w:r>
-              <w:rPr>
-                <w:noProof/>
-                <w:webHidden/>
-              </w:rPr>
               <w:fldChar w:fldCharType="separate"/>
-            </w:r>
-            <w:r>
-              <w:rPr>
-                <w:noProof/>
-                <w:webHidden/>
-              </w:rPr>
               <w:t>8</w:t>
-            </w:r>
-            <w:r>
-              <w:rPr>
-                <w:noProof/>
-                <w:webHidden/>
-              </w:rPr>
               <w:fldChar w:fldCharType="end"/>
             </w:r>
           </w:hyperlink>
@@ -770,46 +404,10 @@
                 <w:webHidden/>
               </w:rPr>
               <w:tab/>
-            </w:r>
-            <w:r>
-              <w:rPr>
-                <w:noProof/>
-                <w:webHidden/>
-              </w:rPr>
               <w:fldChar w:fldCharType="begin"/>
-            </w:r>
-            <w:r>
-              <w:rPr>
-                <w:noProof/>
-                <w:webHidden/>
-              </w:rPr>
               <w:instrText xml:space="preserve"> PAGEREF _Toc243303742 \h </w:instrText>
-            </w:r>
-            <w:r>
-              <w:rPr>
-                <w:noProof/>
-                <w:webHidden/>
-              </w:rPr>
-            </w:r>
-            <w:r>
-              <w:rPr>
-                <w:noProof/>
-                <w:webHidden/>
-              </w:rPr>
               <w:fldChar w:fldCharType="separate"/>
-            </w:r>
-            <w:r>
-              <w:rPr>
-                <w:noProof/>
-                <w:webHidden/>
-              </w:rPr>
               <w:t>8</w:t>
-            </w:r>
-            <w:r>
-              <w:rPr>
-                <w:noProof/>
-                <w:webHidden/>
-              </w:rPr>
               <w:fldChar w:fldCharType="end"/>
             </w:r>
           </w:hyperlink>
@@ -838,46 +436,10 @@
                 <w:webHidden/>
               </w:rPr>
               <w:tab/>
-            </w:r>
-            <w:r>
-              <w:rPr>
-                <w:noProof/>
-                <w:webHidden/>
-              </w:rPr>
               <w:fldChar w:fldCharType="begin"/>
-            </w:r>
-            <w:r>
-              <w:rPr>
-                <w:noProof/>
-                <w:webHidden/>
-              </w:rPr>
               <w:instrText xml:space="preserve"> PAGEREF _Toc243303743 \h </w:instrText>
-            </w:r>
-            <w:r>
-              <w:rPr>
-                <w:noProof/>
-                <w:webHidden/>
-              </w:rPr>
-            </w:r>
-            <w:r>
-              <w:rPr>
-                <w:noProof/>
-                <w:webHidden/>
-              </w:rPr>
               <w:fldChar w:fldCharType="separate"/>
-            </w:r>
-            <w:r>
-              <w:rPr>
-                <w:noProof/>
-                <w:webHidden/>
-              </w:rPr>
               <w:t>9</w:t>
-            </w:r>
-            <w:r>
-              <w:rPr>
-                <w:noProof/>
-                <w:webHidden/>
-              </w:rPr>
               <w:fldChar w:fldCharType="end"/>
             </w:r>
           </w:hyperlink>
@@ -906,46 +468,10 @@
                 <w:webHidden/>
               </w:rPr>
               <w:tab/>
-            </w:r>
-            <w:r>
-              <w:rPr>
-                <w:noProof/>
-                <w:webHidden/>
-              </w:rPr>
               <w:fldChar w:fldCharType="begin"/>
-            </w:r>
-            <w:r>
-              <w:rPr>
-                <w:noProof/>
-                <w:webHidden/>
-              </w:rPr>
               <w:instrText xml:space="preserve"> PAGEREF _Toc243303744 \h </w:instrText>
-            </w:r>
-            <w:r>
-              <w:rPr>
-                <w:noProof/>
-                <w:webHidden/>
-              </w:rPr>
-            </w:r>
-            <w:r>
-              <w:rPr>
-                <w:noProof/>
-                <w:webHidden/>
-              </w:rPr>
               <w:fldChar w:fldCharType="separate"/>
-            </w:r>
-            <w:r>
-              <w:rPr>
-                <w:noProof/>
-                <w:webHidden/>
-              </w:rPr>
               <w:t>9</w:t>
-            </w:r>
-            <w:r>
-              <w:rPr>
-                <w:noProof/>
-                <w:webHidden/>
-              </w:rPr>
               <w:fldChar w:fldCharType="end"/>
             </w:r>
           </w:hyperlink>
@@ -974,46 +500,10 @@
                 <w:webHidden/>
               </w:rPr>
               <w:tab/>
-            </w:r>
-            <w:r>
-              <w:rPr>
-                <w:noProof/>
-                <w:webHidden/>
-              </w:rPr>
               <w:fldChar w:fldCharType="begin"/>
-            </w:r>
-            <w:r>
-              <w:rPr>
-                <w:noProof/>
-                <w:webHidden/>
-              </w:rPr>
               <w:instrText xml:space="preserve"> PAGEREF _Toc243303745 \h </w:instrText>
-            </w:r>
-            <w:r>
-              <w:rPr>
-                <w:noProof/>
-                <w:webHidden/>
-              </w:rPr>
-            </w:r>
-            <w:r>
-              <w:rPr>
-                <w:noProof/>
-                <w:webHidden/>
-              </w:rPr>
               <w:fldChar w:fldCharType="separate"/>
-            </w:r>
-            <w:r>
-              <w:rPr>
-                <w:noProof/>
-                <w:webHidden/>
-              </w:rPr>
               <w:t>9</w:t>
-            </w:r>
-            <w:r>
-              <w:rPr>
-                <w:noProof/>
-                <w:webHidden/>
-              </w:rPr>
               <w:fldChar w:fldCharType="end"/>
             </w:r>
           </w:hyperlink>
@@ -1042,46 +532,10 @@
                 <w:webHidden/>
               </w:rPr>
               <w:tab/>
-            </w:r>
-            <w:r>
-              <w:rPr>
-                <w:noProof/>
-                <w:webHidden/>
-              </w:rPr>
               <w:fldChar w:fldCharType="begin"/>
-            </w:r>
-            <w:r>
-              <w:rPr>
-                <w:noProof/>
-                <w:webHidden/>
-              </w:rPr>
               <w:instrText xml:space="preserve"> PAGEREF _Toc243303746 \h </w:instrText>
-            </w:r>
-            <w:r>
-              <w:rPr>
-                <w:noProof/>
-                <w:webHidden/>
-              </w:rPr>
-            </w:r>
-            <w:r>
-              <w:rPr>
-                <w:noProof/>
-                <w:webHidden/>
-              </w:rPr>
               <w:fldChar w:fldCharType="separate"/>
-            </w:r>
-            <w:r>
-              <w:rPr>
-                <w:noProof/>
-                <w:webHidden/>
-              </w:rPr>
               <w:t>10</w:t>
-            </w:r>
-            <w:r>
-              <w:rPr>
-                <w:noProof/>
-                <w:webHidden/>
-              </w:rPr>
               <w:fldChar w:fldCharType="end"/>
             </w:r>
           </w:hyperlink>
@@ -1110,46 +564,10 @@
                 <w:webHidden/>
               </w:rPr>
               <w:tab/>
-            </w:r>
-            <w:r>
-              <w:rPr>
-                <w:noProof/>
-                <w:webHidden/>
-              </w:rPr>
               <w:fldChar w:fldCharType="begin"/>
-            </w:r>
-            <w:r>
-              <w:rPr>
-                <w:noProof/>
-                <w:webHidden/>
-              </w:rPr>
               <w:instrText xml:space="preserve"> PAGEREF _Toc243303747 \h </w:instrText>
-            </w:r>
-            <w:r>
-              <w:rPr>
-                <w:noProof/>
-                <w:webHidden/>
-              </w:rPr>
-            </w:r>
-            <w:r>
-              <w:rPr>
-                <w:noProof/>
-                <w:webHidden/>
-              </w:rPr>
               <w:fldChar w:fldCharType="separate"/>
-            </w:r>
-            <w:r>
-              <w:rPr>
-                <w:noProof/>
-                <w:webHidden/>
-              </w:rPr>
               <w:t>11</w:t>
-            </w:r>
-            <w:r>
-              <w:rPr>
-                <w:noProof/>
-                <w:webHidden/>
-              </w:rPr>
               <w:fldChar w:fldCharType="end"/>
             </w:r>
           </w:hyperlink>
@@ -1178,46 +596,10 @@
                 <w:webHidden/>
               </w:rPr>
               <w:tab/>
-            </w:r>
-            <w:r>
-              <w:rPr>
-                <w:noProof/>
-                <w:webHidden/>
-              </w:rPr>
               <w:fldChar w:fldCharType="begin"/>
-            </w:r>
-            <w:r>
-              <w:rPr>
-                <w:noProof/>
-                <w:webHidden/>
-              </w:rPr>
               <w:instrText xml:space="preserve"> PAGEREF _Toc243303748 \h </w:instrText>
-            </w:r>
-            <w:r>
-              <w:rPr>
-                <w:noProof/>
-                <w:webHidden/>
-              </w:rPr>
-            </w:r>
-            <w:r>
-              <w:rPr>
-                <w:noProof/>
-                <w:webHidden/>
-              </w:rPr>
               <w:fldChar w:fldCharType="separate"/>
-            </w:r>
-            <w:r>
-              <w:rPr>
-                <w:noProof/>
-                <w:webHidden/>
-              </w:rPr>
               <w:t>11</w:t>
-            </w:r>
-            <w:r>
-              <w:rPr>
-                <w:noProof/>
-                <w:webHidden/>
-              </w:rPr>
               <w:fldChar w:fldCharType="end"/>
             </w:r>
           </w:hyperlink>
@@ -1246,46 +628,10 @@
                 <w:webHidden/>
               </w:rPr>
               <w:tab/>
-            </w:r>
-            <w:r>
-              <w:rPr>
-                <w:noProof/>
-                <w:webHidden/>
-              </w:rPr>
               <w:fldChar w:fldCharType="begin"/>
-            </w:r>
-            <w:r>
-              <w:rPr>
-                <w:noProof/>
-                <w:webHidden/>
-              </w:rPr>
               <w:instrText xml:space="preserve"> PAGEREF _Toc243303749 \h </w:instrText>
-            </w:r>
-            <w:r>
-              <w:rPr>
-                <w:noProof/>
-                <w:webHidden/>
-              </w:rPr>
-            </w:r>
-            <w:r>
-              <w:rPr>
-                <w:noProof/>
-                <w:webHidden/>
-              </w:rPr>
               <w:fldChar w:fldCharType="separate"/>
-            </w:r>
-            <w:r>
-              <w:rPr>
-                <w:noProof/>
-                <w:webHidden/>
-              </w:rPr>
               <w:t>12</w:t>
-            </w:r>
-            <w:r>
-              <w:rPr>
-                <w:noProof/>
-                <w:webHidden/>
-              </w:rPr>
               <w:fldChar w:fldCharType="end"/>
             </w:r>
           </w:hyperlink>
@@ -1314,46 +660,10 @@
                 <w:webHidden/>
               </w:rPr>
               <w:tab/>
-            </w:r>
-            <w:r>
-              <w:rPr>
-                <w:noProof/>
-                <w:webHidden/>
-              </w:rPr>
               <w:fldChar w:fldCharType="begin"/>
-            </w:r>
-            <w:r>
-              <w:rPr>
-                <w:noProof/>
-                <w:webHidden/>
-              </w:rPr>
               <w:instrText xml:space="preserve"> PAGEREF _Toc243303750 \h </w:instrText>
-            </w:r>
-            <w:r>
-              <w:rPr>
-                <w:noProof/>
-                <w:webHidden/>
-              </w:rPr>
-            </w:r>
-            <w:r>
-              <w:rPr>
-                <w:noProof/>
-                <w:webHidden/>
-              </w:rPr>
               <w:fldChar w:fldCharType="separate"/>
-            </w:r>
-            <w:r>
-              <w:rPr>
-                <w:noProof/>
-                <w:webHidden/>
-              </w:rPr>
               <w:t>12</w:t>
-            </w:r>
-            <w:r>
-              <w:rPr>
-                <w:noProof/>
-                <w:webHidden/>
-              </w:rPr>
               <w:fldChar w:fldCharType="end"/>
             </w:r>
           </w:hyperlink>
@@ -1382,46 +692,10 @@
                 <w:webHidden/>
               </w:rPr>
               <w:tab/>
-            </w:r>
-            <w:r>
-              <w:rPr>
-                <w:noProof/>
-                <w:webHidden/>
-              </w:rPr>
               <w:fldChar w:fldCharType="begin"/>
-            </w:r>
-            <w:r>
-              <w:rPr>
-                <w:noProof/>
-                <w:webHidden/>
-              </w:rPr>
               <w:instrText xml:space="preserve"> PAGEREF _Toc243303751 \h </w:instrText>
-            </w:r>
-            <w:r>
-              <w:rPr>
-                <w:noProof/>
-                <w:webHidden/>
-              </w:rPr>
-            </w:r>
-            <w:r>
-              <w:rPr>
-                <w:noProof/>
-                <w:webHidden/>
-              </w:rPr>
               <w:fldChar w:fldCharType="separate"/>
-            </w:r>
-            <w:r>
-              <w:rPr>
-                <w:noProof/>
-                <w:webHidden/>
-              </w:rPr>
               <w:t>12</w:t>
-            </w:r>
-            <w:r>
-              <w:rPr>
-                <w:noProof/>
-                <w:webHidden/>
-              </w:rPr>
               <w:fldChar w:fldCharType="end"/>
             </w:r>
           </w:hyperlink>
@@ -1450,46 +724,10 @@
                 <w:webHidden/>
               </w:rPr>
               <w:tab/>
-            </w:r>
-            <w:r>
-              <w:rPr>
-                <w:noProof/>
-                <w:webHidden/>
-              </w:rPr>
               <w:fldChar w:fldCharType="begin"/>
-            </w:r>
-            <w:r>
-              <w:rPr>
-                <w:noProof/>
-                <w:webHidden/>
-              </w:rPr>
               <w:instrText xml:space="preserve"> PAGEREF _Toc243303752 \h </w:instrText>
-            </w:r>
-            <w:r>
-              <w:rPr>
-                <w:noProof/>
-                <w:webHidden/>
-              </w:rPr>
-            </w:r>
-            <w:r>
-              <w:rPr>
-                <w:noProof/>
-                <w:webHidden/>
-              </w:rPr>
               <w:fldChar w:fldCharType="separate"/>
-            </w:r>
-            <w:r>
-              <w:rPr>
-                <w:noProof/>
-                <w:webHidden/>
-              </w:rPr>
               <w:t>13</w:t>
-            </w:r>
-            <w:r>
-              <w:rPr>
-                <w:noProof/>
-                <w:webHidden/>
-              </w:rPr>
               <w:fldChar w:fldCharType="end"/>
             </w:r>
           </w:hyperlink>
@@ -1518,46 +756,10 @@
                 <w:webHidden/>
               </w:rPr>
               <w:tab/>
-            </w:r>
-            <w:r>
-              <w:rPr>
-                <w:noProof/>
-                <w:webHidden/>
-              </w:rPr>
               <w:fldChar w:fldCharType="begin"/>
-            </w:r>
-            <w:r>
-              <w:rPr>
-                <w:noProof/>
-                <w:webHidden/>
-              </w:rPr>
               <w:instrText xml:space="preserve"> PAGEREF _Toc243303753 \h </w:instrText>
-            </w:r>
-            <w:r>
-              <w:rPr>
-                <w:noProof/>
-                <w:webHidden/>
-              </w:rPr>
-            </w:r>
-            <w:r>
-              <w:rPr>
-                <w:noProof/>
-                <w:webHidden/>
-              </w:rPr>
               <w:fldChar w:fldCharType="separate"/>
-            </w:r>
-            <w:r>
-              <w:rPr>
-                <w:noProof/>
-                <w:webHidden/>
-              </w:rPr>
               <w:t>13</w:t>
-            </w:r>
-            <w:r>
-              <w:rPr>
-                <w:noProof/>
-                <w:webHidden/>
-              </w:rPr>
               <w:fldChar w:fldCharType="end"/>
             </w:r>
           </w:hyperlink>
@@ -1586,46 +788,10 @@
                 <w:webHidden/>
               </w:rPr>
               <w:tab/>
-            </w:r>
-            <w:r>
-              <w:rPr>
-                <w:noProof/>
-                <w:webHidden/>
-              </w:rPr>
               <w:fldChar w:fldCharType="begin"/>
-            </w:r>
-            <w:r>
-              <w:rPr>
-                <w:noProof/>
-                <w:webHidden/>
-              </w:rPr>
               <w:instrText xml:space="preserve"> PAGEREF _Toc243303754 \h </w:instrText>
-            </w:r>
-            <w:r>
-              <w:rPr>
-                <w:noProof/>
-                <w:webHidden/>
-              </w:rPr>
-            </w:r>
-            <w:r>
-              <w:rPr>
-                <w:noProof/>
-                <w:webHidden/>
-              </w:rPr>
               <w:fldChar w:fldCharType="separate"/>
-            </w:r>
-            <w:r>
-              <w:rPr>
-                <w:noProof/>
-                <w:webHidden/>
-              </w:rPr>
               <w:t>14</w:t>
-            </w:r>
-            <w:r>
-              <w:rPr>
-                <w:noProof/>
-                <w:webHidden/>
-              </w:rPr>
               <w:fldChar w:fldCharType="end"/>
             </w:r>
           </w:hyperlink>
@@ -1654,46 +820,10 @@
                 <w:webHidden/>
               </w:rPr>
               <w:tab/>
-            </w:r>
-            <w:r>
-              <w:rPr>
-                <w:noProof/>
-                <w:webHidden/>
-              </w:rPr>
               <w:fldChar w:fldCharType="begin"/>
-            </w:r>
-            <w:r>
-              <w:rPr>
-                <w:noProof/>
-                <w:webHidden/>
-              </w:rPr>
               <w:instrText xml:space="preserve"> PAGEREF _Toc243303755 \h </w:instrText>
-            </w:r>
-            <w:r>
-              <w:rPr>
-                <w:noProof/>
-                <w:webHidden/>
-              </w:rPr>
-            </w:r>
-            <w:r>
-              <w:rPr>
-                <w:noProof/>
-                <w:webHidden/>
-              </w:rPr>
               <w:fldChar w:fldCharType="separate"/>
-            </w:r>
-            <w:r>
-              <w:rPr>
-                <w:noProof/>
-                <w:webHidden/>
-              </w:rPr>
               <w:t>15</w:t>
-            </w:r>
-            <w:r>
-              <w:rPr>
-                <w:noProof/>
-                <w:webHidden/>
-              </w:rPr>
               <w:fldChar w:fldCharType="end"/>
             </w:r>
           </w:hyperlink>
@@ -1722,46 +852,10 @@
                 <w:webHidden/>
               </w:rPr>
               <w:tab/>
-            </w:r>
-            <w:r>
-              <w:rPr>
-                <w:noProof/>
-                <w:webHidden/>
-              </w:rPr>
               <w:fldChar w:fldCharType="begin"/>
-            </w:r>
-            <w:r>
-              <w:rPr>
-                <w:noProof/>
-                <w:webHidden/>
-              </w:rPr>
               <w:instrText xml:space="preserve"> PAGEREF _Toc243303756 \h </w:instrText>
-            </w:r>
-            <w:r>
-              <w:rPr>
-                <w:noProof/>
-                <w:webHidden/>
-              </w:rPr>
-            </w:r>
-            <w:r>
-              <w:rPr>
-                <w:noProof/>
-                <w:webHidden/>
-              </w:rPr>
               <w:fldChar w:fldCharType="separate"/>
-            </w:r>
-            <w:r>
-              <w:rPr>
-                <w:noProof/>
-                <w:webHidden/>
-              </w:rPr>
               <w:t>15</w:t>
-            </w:r>
-            <w:r>
-              <w:rPr>
-                <w:noProof/>
-                <w:webHidden/>
-              </w:rPr>
               <w:fldChar w:fldCharType="end"/>
             </w:r>
           </w:hyperlink>
@@ -1790,46 +884,10 @@
                 <w:webHidden/>
               </w:rPr>
               <w:tab/>
-            </w:r>
-            <w:r>
-              <w:rPr>
-                <w:noProof/>
-                <w:webHidden/>
-              </w:rPr>
               <w:fldChar w:fldCharType="begin"/>
-            </w:r>
-            <w:r>
-              <w:rPr>
-                <w:noProof/>
-                <w:webHidden/>
-              </w:rPr>
               <w:instrText xml:space="preserve"> PAGEREF _Toc243303757 \h </w:instrText>
-            </w:r>
-            <w:r>
-              <w:rPr>
-                <w:noProof/>
-                <w:webHidden/>
-              </w:rPr>
-            </w:r>
-            <w:r>
-              <w:rPr>
-                <w:noProof/>
-                <w:webHidden/>
-              </w:rPr>
               <w:fldChar w:fldCharType="separate"/>
-            </w:r>
-            <w:r>
-              <w:rPr>
-                <w:noProof/>
-                <w:webHidden/>
-              </w:rPr>
               <w:t>15</w:t>
-            </w:r>
-            <w:r>
-              <w:rPr>
-                <w:noProof/>
-                <w:webHidden/>
-              </w:rPr>
               <w:fldChar w:fldCharType="end"/>
             </w:r>
           </w:hyperlink>
@@ -1858,46 +916,10 @@
                 <w:webHidden/>
               </w:rPr>
               <w:tab/>
-            </w:r>
-            <w:r>
-              <w:rPr>
-                <w:noProof/>
-                <w:webHidden/>
-              </w:rPr>
               <w:fldChar w:fldCharType="begin"/>
-            </w:r>
-            <w:r>
-              <w:rPr>
-                <w:noProof/>
-                <w:webHidden/>
-              </w:rPr>
               <w:instrText xml:space="preserve"> PAGEREF _Toc243303758 \h </w:instrText>
-            </w:r>
-            <w:r>
-              <w:rPr>
-                <w:noProof/>
-                <w:webHidden/>
-              </w:rPr>
-            </w:r>
-            <w:r>
-              <w:rPr>
-                <w:noProof/>
-                <w:webHidden/>
-              </w:rPr>
               <w:fldChar w:fldCharType="separate"/>
-            </w:r>
-            <w:r>
-              <w:rPr>
-                <w:noProof/>
-                <w:webHidden/>
-              </w:rPr>
               <w:t>16</w:t>
-            </w:r>
-            <w:r>
-              <w:rPr>
-                <w:noProof/>
-                <w:webHidden/>
-              </w:rPr>
               <w:fldChar w:fldCharType="end"/>
             </w:r>
           </w:hyperlink>
@@ -1926,46 +948,10 @@
                 <w:webHidden/>
               </w:rPr>
               <w:tab/>
-            </w:r>
-            <w:r>
-              <w:rPr>
-                <w:noProof/>
-                <w:webHidden/>
-              </w:rPr>
               <w:fldChar w:fldCharType="begin"/>
-            </w:r>
-            <w:r>
-              <w:rPr>
-                <w:noProof/>
-                <w:webHidden/>
-              </w:rPr>
               <w:instrText xml:space="preserve"> PAGEREF _Toc243303759 \h </w:instrText>
-            </w:r>
-            <w:r>
-              <w:rPr>
-                <w:noProof/>
-                <w:webHidden/>
-              </w:rPr>
-            </w:r>
-            <w:r>
-              <w:rPr>
-                <w:noProof/>
-                <w:webHidden/>
-              </w:rPr>
               <w:fldChar w:fldCharType="separate"/>
-            </w:r>
-            <w:r>
-              <w:rPr>
-                <w:noProof/>
-                <w:webHidden/>
-              </w:rPr>
               <w:t>16</w:t>
-            </w:r>
-            <w:r>
-              <w:rPr>
-                <w:noProof/>
-                <w:webHidden/>
-              </w:rPr>
               <w:fldChar w:fldCharType="end"/>
             </w:r>
           </w:hyperlink>
@@ -1994,46 +980,10 @@
                 <w:webHidden/>
               </w:rPr>
               <w:tab/>
-            </w:r>
-            <w:r>
-              <w:rPr>
-                <w:noProof/>
-                <w:webHidden/>
-              </w:rPr>
               <w:fldChar w:fldCharType="begin"/>
-            </w:r>
-            <w:r>
-              <w:rPr>
-                <w:noProof/>
-                <w:webHidden/>
-              </w:rPr>
               <w:instrText xml:space="preserve"> PAGEREF _Toc243303760 \h </w:instrText>
-            </w:r>
-            <w:r>
-              <w:rPr>
-                <w:noProof/>
-                <w:webHidden/>
-              </w:rPr>
-            </w:r>
-            <w:r>
-              <w:rPr>
-                <w:noProof/>
-                <w:webHidden/>
-              </w:rPr>
               <w:fldChar w:fldCharType="separate"/>
-            </w:r>
-            <w:r>
-              <w:rPr>
-                <w:noProof/>
-                <w:webHidden/>
-              </w:rPr>
               <w:t>17</w:t>
-            </w:r>
-            <w:r>
-              <w:rPr>
-                <w:noProof/>
-                <w:webHidden/>
-              </w:rPr>
               <w:fldChar w:fldCharType="end"/>
             </w:r>
           </w:hyperlink>
@@ -2062,46 +1012,10 @@
                 <w:webHidden/>
               </w:rPr>
               <w:tab/>
-            </w:r>
-            <w:r>
-              <w:rPr>
-                <w:noProof/>
-                <w:webHidden/>
-              </w:rPr>
               <w:fldChar w:fldCharType="begin"/>
-            </w:r>
-            <w:r>
-              <w:rPr>
-                <w:noProof/>
-                <w:webHidden/>
-              </w:rPr>
               <w:instrText xml:space="preserve"> PAGEREF _Toc243303761 \h </w:instrText>
-            </w:r>
-            <w:r>
-              <w:rPr>
-                <w:noProof/>
-                <w:webHidden/>
-              </w:rPr>
-            </w:r>
-            <w:r>
-              <w:rPr>
-                <w:noProof/>
-                <w:webHidden/>
-              </w:rPr>
               <w:fldChar w:fldCharType="separate"/>
-            </w:r>
-            <w:r>
-              <w:rPr>
-                <w:noProof/>
-                <w:webHidden/>
-              </w:rPr>
               <w:t>19</w:t>
-            </w:r>
-            <w:r>
-              <w:rPr>
-                <w:noProof/>
-                <w:webHidden/>
-              </w:rPr>
               <w:fldChar w:fldCharType="end"/>
             </w:r>
           </w:hyperlink>
@@ -2130,46 +1044,10 @@
                 <w:webHidden/>
               </w:rPr>
               <w:tab/>
-            </w:r>
-            <w:r>
-              <w:rPr>
-                <w:noProof/>
-                <w:webHidden/>
-              </w:rPr>
               <w:fldChar w:fldCharType="begin"/>
-            </w:r>
-            <w:r>
-              <w:rPr>
-                <w:noProof/>
-                <w:webHidden/>
-              </w:rPr>
               <w:instrText xml:space="preserve"> PAGEREF _Toc243303762 \h </w:instrText>
-            </w:r>
-            <w:r>
-              <w:rPr>
-                <w:noProof/>
-                <w:webHidden/>
-              </w:rPr>
-            </w:r>
-            <w:r>
-              <w:rPr>
-                <w:noProof/>
-                <w:webHidden/>
-              </w:rPr>
               <w:fldChar w:fldCharType="separate"/>
-            </w:r>
-            <w:r>
-              <w:rPr>
-                <w:noProof/>
-                <w:webHidden/>
-              </w:rPr>
               <w:t>21</w:t>
-            </w:r>
-            <w:r>
-              <w:rPr>
-                <w:noProof/>
-                <w:webHidden/>
-              </w:rPr>
               <w:fldChar w:fldCharType="end"/>
             </w:r>
           </w:hyperlink>
@@ -2198,46 +1076,10 @@
                 <w:webHidden/>
               </w:rPr>
               <w:tab/>
-            </w:r>
-            <w:r>
-              <w:rPr>
-                <w:noProof/>
-                <w:webHidden/>
-              </w:rPr>
               <w:fldChar w:fldCharType="begin"/>
-            </w:r>
-            <w:r>
-              <w:rPr>
-                <w:noProof/>
-                <w:webHidden/>
-              </w:rPr>
               <w:instrText xml:space="preserve"> PAGEREF _Toc243303763 \h </w:instrText>
-            </w:r>
-            <w:r>
-              <w:rPr>
-                <w:noProof/>
-                <w:webHidden/>
-              </w:rPr>
-            </w:r>
-            <w:r>
-              <w:rPr>
-                <w:noProof/>
-                <w:webHidden/>
-              </w:rPr>
               <w:fldChar w:fldCharType="separate"/>
-            </w:r>
-            <w:r>
-              <w:rPr>
-                <w:noProof/>
-                <w:webHidden/>
-              </w:rPr>
               <w:t>21</w:t>
-            </w:r>
-            <w:r>
-              <w:rPr>
-                <w:noProof/>
-                <w:webHidden/>
-              </w:rPr>
               <w:fldChar w:fldCharType="end"/>
             </w:r>
           </w:hyperlink>
@@ -2266,46 +1108,10 @@
                 <w:webHidden/>
               </w:rPr>
               <w:tab/>
-            </w:r>
-            <w:r>
-              <w:rPr>
-                <w:noProof/>
-                <w:webHidden/>
-              </w:rPr>
               <w:fldChar w:fldCharType="begin"/>
-            </w:r>
-            <w:r>
-              <w:rPr>
-                <w:noProof/>
-                <w:webHidden/>
-              </w:rPr>
               <w:instrText xml:space="preserve"> PAGEREF _Toc243303764 \h </w:instrText>
-            </w:r>
-            <w:r>
-              <w:rPr>
-                <w:noProof/>
-                <w:webHidden/>
-              </w:rPr>
-            </w:r>
-            <w:r>
-              <w:rPr>
-                <w:noProof/>
-                <w:webHidden/>
-              </w:rPr>
               <w:fldChar w:fldCharType="separate"/>
-            </w:r>
-            <w:r>
-              <w:rPr>
-                <w:noProof/>
-                <w:webHidden/>
-              </w:rPr>
               <w:t>22</w:t>
-            </w:r>
-            <w:r>
-              <w:rPr>
-                <w:noProof/>
-                <w:webHidden/>
-              </w:rPr>
               <w:fldChar w:fldCharType="end"/>
             </w:r>
           </w:hyperlink>
@@ -2334,46 +1140,10 @@
                 <w:webHidden/>
               </w:rPr>
               <w:tab/>
-            </w:r>
-            <w:r>
-              <w:rPr>
-                <w:noProof/>
-                <w:webHidden/>
-              </w:rPr>
               <w:fldChar w:fldCharType="begin"/>
-            </w:r>
-            <w:r>
-              <w:rPr>
-                <w:noProof/>
-                <w:webHidden/>
-              </w:rPr>
               <w:instrText xml:space="preserve"> PAGEREF _Toc243303765 \h </w:instrText>
-            </w:r>
-            <w:r>
-              <w:rPr>
-                <w:noProof/>
-                <w:webHidden/>
-              </w:rPr>
-            </w:r>
-            <w:r>
-              <w:rPr>
-                <w:noProof/>
-                <w:webHidden/>
-              </w:rPr>
               <w:fldChar w:fldCharType="separate"/>
-            </w:r>
-            <w:r>
-              <w:rPr>
-                <w:noProof/>
-                <w:webHidden/>
-              </w:rPr>
               <w:t>23</w:t>
-            </w:r>
-            <w:r>
-              <w:rPr>
-                <w:noProof/>
-                <w:webHidden/>
-              </w:rPr>
               <w:fldChar w:fldCharType="end"/>
             </w:r>
           </w:hyperlink>
@@ -2670,8 +1440,6 @@
           <w:p>
             <w:r>
               <w:t xml:space="preserve">Triage of an uncurated stream, learned trust per person, provenance strings, half-life per </w:t>
-            </w:r>
-            <w:r>
               <w:lastRenderedPageBreak/>
               <w:t>claim; side-by-side with llm-wiki-agent in the README</w:t>
             </w:r>
@@ -3305,8 +2073,6 @@
     <w:p>
       <w:r>
         <w:t xml:space="preserve">3. Assemble. Gather every part back into one Document: ordered sections, each with provenance (email body, attachment page 3, image 2). An email with three attachments is one item, not four. A linked </w:t>
-      </w:r>
-      <w:r>
         <w:lastRenderedPageBreak/>
         <w:t>article, LinkedIn share or YouTube video becomes its own child item with its own author and source (the writer, the LinkedIn profile, the YouTube channel), linked to the forward that shared it. A voice note is the sender's own thought: author is the user.</w:t>
       </w:r>
@@ -6063,7 +4829,7 @@
         </w:numPr>
       </w:pPr>
       <w:r>
-        <w:t>eval/seed_corpus/originals/: the files as received. .eml for emails and newsletters, .html or a URL for articles and LinkedIn, .pdf, .png, .ogg voice notes, a .txt with a YouTube URL, Telegram exports as JSON.</w:t>
+        <w:t xml:space="preserve">eval/seed_corpus/originals/: the files as received. Telegram Desktop copy-pastes and LinkedIn pastes as .md, .eml for emails and newsletters, .html or a URL for articles, .pdf, .png, .ogg voice notes, a .txt with a YouTube URL.</w:t>
       </w:r>
     </w:p>
     <w:p>
@@ -6375,6 +5141,12 @@
       </w:r>
     </w:p>
     <w:p>
+      <w:pPr/>
+      <w:r>
+        <w:t xml:space="preserve">Status on 19 October: six seeds import cleanly. Three are Telegram copies of an AI assistant's answers, one of them a near-duplicate of another sent 8 seconds later; one is an event agenda; one is a Russian channel repost; one is a LinkedIn Pulse article. uv run refresher-import eval/seed_corpus writes raw/*.json, --check fails when raw/ is stale, and uv run pytest covers the parsers and the corpus. The Telegram header names who sent the message, which goes to forwarded_by, not author_hint: the AI answers carry author "AI assistant", so the people they list become mentions, not authors.</w:t>
+      </w:r>
+    </w:p>
+    <w:p>
       <w:r>
         <w:t>Growing it: every real ingest already leaves a RawItem in raw/. refresher seed add &lt;item_id&gt; copies one into the seed with labels, so the corpus grows from real use.</w:t>
       </w:r>
@@ -6654,8 +5426,6 @@
           <w:p>
             <w:r>
               <w:t xml:space="preserve">Token Factory hosts no speech model. CC BY 4.0, 25 European languages including Russian and </w:t>
-            </w:r>
-            <w:r>
               <w:lastRenderedPageBreak/>
               <w:t>Ukrainian; checked 18 October 2026</w:t>
             </w:r>
@@ -7115,8 +5885,6 @@
           <w:p>
             <w:r>
               <w:t xml:space="preserve">MCP and platform: MCP endpoint over the refresher's tools, Dockerfile, Serverless </w:t>
-            </w:r>
-            <w:r>
               <w:lastRenderedPageBreak/>
               <w:t>Endpoint and Job, demo page, video</w:t>
             </w:r>
@@ -7195,7 +5963,7 @@
         </w:numPr>
       </w:pPr>
       <w:r>
-        <w:t>The RawItem schema that every ingestion channel produces, Telegram, email or a future mobile app: channel, source_id, source_name, author_hint (name, handle, email, url), captured_at, published_at, url, kind, text, attachments (mime, path).</w:t>
+        <w:t xml:space="preserve">The RawItem schema that every ingestion channel produces, Telegram, email or a future mobile app, in refresher/schemas.py (landed 19 October): channel, source_id, source_name, author_hint (who wrote it: name, handle, email, url), forwarded_by (who shared it with us, same fields), captured_at, published_at, url, kind (input shape for routing: text, link, file, image, voice, video), text, attachments (mime, path), schema_version. Unknown fields are rejected and timestamps must carry a timezone. content_hash is derived from the text and url for exact-duplicate checks; near-duplicates are the relation check's job.</w:t>
       </w:r>
     </w:p>
     <w:p>

</xml_diff>

<commit_message>
Add knowledge management: scoring, in-memory graph store, vault views, KM pass, eval
- refresher/schemas.py reads ingestion's processed_extraction record
  (Extraction, Claim, Entity, Source, Triage) and adds Override.
- refresher/scoring.py: half-life freshness, confirmation, bands, noise, trust.
- graph/store.py drafts the GraphStore interface; graph/memory.py is an
  in-memory store replayed from processed/ with a lexical relation baseline.
- refresher/vault.py writes the Obsidian wiki and keeps user notes and
  user_* frontmatter as overrides across rebuilds.
- refresher/km.py: the health report at any moment (--at).
- refresher/evaluate.py scores a vault against manifest labels.
- uv run refresher rebuild|km|eval; fixture vault in tests/fixtures.
- Plan doc: where knowledge lives, the KM pass, Extraction interface,
  extractor model risk.

Co-Authored-By: Claude Opus 5.5 <noreply@anthropic.com>
</commit_message>
<xml_diff>
--- a/Refresher hackathon plan and team split v2.docx
+++ b/Refresher hackathon plan and team split v2.docx
@@ -19,6 +19,14 @@
     </w:p>
     <w:sdt>
       <w:sdtPr>
+        <w:rPr>
+          <w:rFonts w:ascii="Calibri" w:eastAsia="Calibri" w:hAnsi="Calibri" w:cs="Calibri"/>
+          <w:b w:val="0"/>
+          <w:bCs w:val="0"/>
+          <w:color w:val="auto"/>
+          <w:sz w:val="22"/>
+          <w:szCs w:val="22"/>
+        </w:rPr>
         <w:id w:val="-1661232039"/>
         <w:docPartObj>
           <w:docPartGallery w:val="Table of Contents"/>
@@ -27,11 +35,7 @@
       </w:sdtPr>
       <w:sdtEndPr>
         <w:rPr>
-          <w:rFonts w:ascii="Calibri" w:eastAsia="Calibri" w:hAnsi="Calibri" w:cs="Calibri"/>
           <w:noProof/>
-          <w:color w:val="auto"/>
-          <w:sz w:val="22"/>
-          <w:szCs w:val="22"/>
         </w:rPr>
       </w:sdtEndPr>
       <w:sdtContent>
@@ -3495,6 +3499,311 @@
     </w:p>
     <w:p>
       <w:pPr>
+        <w:pStyle w:val="Heading3"/>
+      </w:pPr>
+      <w:r>
+        <w:t xml:space="preserve">Where knowledge lives</w:t>
+      </w:r>
+    </w:p>
+    <w:p>
+      <w:pPr/>
+      <w:r>
+        <w:t xml:space="preserve">No SQLite and no separate importer. Three tiers, and only the first one is irreplaceable.</w:t>
+      </w:r>
+    </w:p>
+    <w:tbl>
+      <w:tblPr>
+        <w:tblStyle w:val="TableGrid"/>
+        <w:tblW w:w="0" w:type="auto"/>
+        <w:tblLayout w:type="fixed"/>
+        <w:tblLook w:val="04A0" w:firstRow="1" w:lastRow="0" w:firstColumn="0" w:lastColumn="0" w:noHBand="0" w:noVBand="1"/>
+      </w:tblPr>
+      <w:tblGrid>
+        <w:gridCol w:w="1300"/>
+        <w:gridCol w:w="3260"/>
+        <w:gridCol w:w="3200"/>
+        <w:gridCol w:w="1600"/>
+      </w:tblGrid>
+      <w:tr>
+        <w:trPr>
+          <w:tblHeader/>
+        </w:trPr>
+        <w:tc>
+          <w:tcPr>
+            <w:tcW w:w="1300" w:type="dxa"/>
+            <w:shd w:val="clear" w:color="auto" w:fill="F2F2F2"/>
+          </w:tcPr>
+          <w:p>
+            <w:pPr/>
+            <w:r>
+              <w:t xml:space="preserve">Tier</w:t>
+            </w:r>
+          </w:p>
+        </w:tc>
+        <w:tc>
+          <w:tcPr>
+            <w:tcW w:w="3260" w:type="dxa"/>
+            <w:shd w:val="clear" w:color="auto" w:fill="F2F2F2"/>
+          </w:tcPr>
+          <w:p>
+            <w:pPr/>
+            <w:r>
+              <w:t xml:space="preserve">What</w:t>
+            </w:r>
+          </w:p>
+        </w:tc>
+        <w:tc>
+          <w:tcPr>
+            <w:tcW w:w="3200" w:type="dxa"/>
+            <w:shd w:val="clear" w:color="auto" w:fill="F2F2F2"/>
+          </w:tcPr>
+          <w:p>
+            <w:pPr/>
+            <w:r>
+              <w:t xml:space="preserve">Where</w:t>
+            </w:r>
+          </w:p>
+        </w:tc>
+        <w:tc>
+          <w:tcPr>
+            <w:tcW w:w="1600" w:type="dxa"/>
+            <w:shd w:val="clear" w:color="auto" w:fill="F2F2F2"/>
+          </w:tcPr>
+          <w:p>
+            <w:pPr/>
+            <w:r>
+              <w:t xml:space="preserve">Rebuilt from</w:t>
+            </w:r>
+          </w:p>
+        </w:tc>
+      </w:tr>
+      <w:tr>
+        <w:tc>
+          <w:tcPr>
+            <w:tcW w:w="1300" w:type="dxa"/>
+          </w:tcPr>
+          <w:p>
+            <w:pPr/>
+            <w:r>
+              <w:t xml:space="preserve">Truth</w:t>
+            </w:r>
+          </w:p>
+        </w:tc>
+        <w:tc>
+          <w:tcPr>
+            <w:tcW w:w="3260" w:type="dxa"/>
+          </w:tcPr>
+          <w:p>
+            <w:pPr/>
+            <w:r>
+              <w:t xml:space="preserve">raw captures, ingestion stage records, processed/ Extraction records, overrides.yaml with the user's votes and pinned durability or trust, log.md</w:t>
+            </w:r>
+          </w:p>
+        </w:tc>
+        <w:tc>
+          <w:tcPr>
+            <w:tcW w:w="3200" w:type="dxa"/>
+          </w:tcPr>
+          <w:p>
+            <w:pPr/>
+            <w:r>
+              <w:t xml:space="preserve">the vault, a separate private git repository (REFRESHER_VAULT); git history is the backup and the audit trail</w:t>
+            </w:r>
+          </w:p>
+        </w:tc>
+        <w:tc>
+          <w:tcPr>
+            <w:tcW w:w="1600" w:type="dxa"/>
+          </w:tcPr>
+          <w:p>
+            <w:pPr/>
+            <w:r>
+              <w:t xml:space="preserve">nothing: this is the source</w:t>
+            </w:r>
+          </w:p>
+        </w:tc>
+      </w:tr>
+      <w:tr>
+        <w:tc>
+          <w:tcPr>
+            <w:tcW w:w="1300" w:type="dxa"/>
+          </w:tcPr>
+          <w:p>
+            <w:pPr/>
+            <w:r>
+              <w:t xml:space="preserve">Index</w:t>
+            </w:r>
+          </w:p>
+        </w:tc>
+        <w:tc>
+          <w:tcPr>
+            <w:tcW w:w="3260" w:type="dxa"/>
+          </w:tcPr>
+          <w:p>
+            <w:pPr/>
+            <w:r>
+              <w:t xml:space="preserve">items, sections, claims, ideas, topics, people, sources and their edges; vector and full-text indexes once embeddings land</w:t>
+            </w:r>
+          </w:p>
+        </w:tc>
+        <w:tc>
+          <w:tcPr>
+            <w:tcW w:w="3200" w:type="dxa"/>
+          </w:tcPr>
+          <w:p>
+            <w:pPr/>
+            <w:r>
+              <w:t xml:space="preserve">Neo4j behind GraphStore; MemoryStore, an in-memory store replayed from processed/, until Victor's module lands and as the test double after</w:t>
+            </w:r>
+          </w:p>
+        </w:tc>
+        <w:tc>
+          <w:tcPr>
+            <w:tcW w:w="1600" w:type="dxa"/>
+          </w:tcPr>
+          <w:p>
+            <w:pPr/>
+            <w:r>
+              <w:t xml:space="preserve">processed/ plus overrides</w:t>
+            </w:r>
+          </w:p>
+        </w:tc>
+      </w:tr>
+      <w:tr>
+        <w:tc>
+          <w:tcPr>
+            <w:tcW w:w="1300" w:type="dxa"/>
+          </w:tcPr>
+          <w:p>
+            <w:pPr/>
+            <w:r>
+              <w:t xml:space="preserve">Views</w:t>
+            </w:r>
+          </w:p>
+        </w:tc>
+        <w:tc>
+          <w:tcPr>
+            <w:tcW w:w="3260" w:type="dxa"/>
+          </w:tcPr>
+          <w:p>
+            <w:pPr/>
+            <w:r>
+              <w:t xml:space="preserve">Obsidian notes for items, people and sources (ideas and topics once the review job builds them), health.md, index.md</w:t>
+            </w:r>
+          </w:p>
+        </w:tc>
+        <w:tc>
+          <w:tcPr>
+            <w:tcW w:w="3200" w:type="dxa"/>
+          </w:tcPr>
+          <w:p>
+            <w:pPr/>
+            <w:r>
+              <w:t xml:space="preserve">the vault's wiki/ folder; open the vault folder in Obsidian</w:t>
+            </w:r>
+          </w:p>
+        </w:tc>
+        <w:tc>
+          <w:tcPr>
+            <w:tcW w:w="1600" w:type="dxa"/>
+          </w:tcPr>
+          <w:p>
+            <w:pPr/>
+            <w:r>
+              <w:t xml:space="preserve">the index</w:t>
+            </w:r>
+          </w:p>
+        </w:tc>
+      </w:tr>
+    </w:tbl>
+    <w:p>
+      <w:pPr/>
+      <w:r>
+        <w:t xml:space="preserve">Personal forwards stay out of the code repository, which may be public at submission. Generated notes keep anything written below the "your notes" marker, and the frontmatter keys user_durability (item notes) and user_trust (people notes) are read back into overrides.yaml on every rebuild, so an edit in Obsidian survives a rebuild and beats the model.</w:t>
+      </w:r>
+    </w:p>
+    <w:p>
+      <w:pPr>
+        <w:pStyle w:val="Heading3"/>
+      </w:pPr>
+      <w:r>
+        <w:t xml:space="preserve">The knowledge pass and how we evaluate it</w:t>
+      </w:r>
+    </w:p>
+    <w:p>
+      <w:pPr/>
+      <w:r>
+        <w:t xml:space="preserve">uv run refresher rebuild replays processed/ and the overrides into the store, writes wiki/ and appends to log.md. Items that fail ingestion's quality gate or that triage skipped stay out of the graph and are listed as held back. The same processed files always give the same notes, byte for byte.</w:t>
+      </w:r>
+    </w:p>
+    <w:p>
+      <w:pPr/>
+      <w:r>
+        <w:t xml:space="preserve">uv run refresher km --at DATE scores every claim at that moment, with no model calls, and writes the health report:</w:t>
+      </w:r>
+    </w:p>
+    <w:p>
+      <w:pPr>
+        <w:pStyle w:val="ListParagraph"/>
+        <w:numPr>
+          <w:ilvl w:val="0"/>
+          <w:numId w:val="4"/>
+        </w:numPr>
+      </w:pPr>
+      <w:r>
+        <w:t xml:space="preserve">claims by durability class and freshness band: fresh at 0.5 and above, fading down to 0.25, stale below</w:t>
+      </w:r>
+    </w:p>
+    <w:p>
+      <w:pPr>
+        <w:pStyle w:val="ListParagraph"/>
+        <w:numPr>
+          <w:ilvl w:val="0"/>
+          <w:numId w:val="4"/>
+        </w:numPr>
+      </w:pPr>
+      <w:r>
+        <w:t xml:space="preserve">reposts, supersession chains and open contradictions; claims collapsed as noise; confirmations</w:t>
+      </w:r>
+    </w:p>
+    <w:p>
+      <w:pPr>
+        <w:pStyle w:val="ListParagraph"/>
+        <w:numPr>
+          <w:ilvl w:val="0"/>
+          <w:numId w:val="4"/>
+        </w:numPr>
+      </w:pPr>
+      <w:r>
+        <w:t xml:space="preserve">claims that turn from fresh to fading within 14 days, and durable claims (reference, foundation) already fading: the candidates for the next refresher</w:t>
+      </w:r>
+    </w:p>
+    <w:p>
+      <w:pPr>
+        <w:pStyle w:val="ListParagraph"/>
+        <w:numPr>
+          <w:ilvl w:val="0"/>
+          <w:numId w:val="4"/>
+        </w:numPr>
+      </w:pPr>
+      <w:r>
+        <w:t xml:space="preserve">items held back by the quality gate, and people still waiting for enrichment</w:t>
+      </w:r>
+    </w:p>
+    <w:p>
+      <w:pPr/>
+      <w:r>
+        <w:t xml:space="preserve">--at moves the clock, so the demo and the tests can show decay: on 15 January 2027 the Redis talk agenda (ephemeral) is stale and collapsed, while the reference lists are still fresh.</w:t>
+      </w:r>
+    </w:p>
+    <w:p>
+      <w:pPr/>
+      <w:r>
+        <w:t xml:space="preserve">uv run refresher eval scores a built vault against the seed manifest's expected labels: author, kind, durability, claim count, people recall and precision, expected relations (the introspection list duplicates the people list; the synthetic correction supersedes the original), and supersession. Until Victor's relation check lands, the store uses a lexical baseline: near-identical text is a repost, the same claim from a different author is a confirmation; supersession and contradiction need his model check and show as misses.</w:t>
+      </w:r>
+    </w:p>
+    <w:p>
+      <w:pPr>
         <w:pStyle w:val="Heading2"/>
       </w:pPr>
       <w:bookmarkStart w:id="19" w:name="_Toc243303751"/>
@@ -4829,7 +5138,7 @@
         </w:numPr>
       </w:pPr>
       <w:r>
-        <w:t xml:space="preserve">eval/seed_corpus/originals/: the files as received. Telegram Desktop copy-pastes and LinkedIn pastes as .md, .eml for emails and newsletters, .html or a URL for articles, .pdf, .png, .ogg voice notes, a .txt with a YouTube URL.</w:t>
+        <w:t>eval/seed_corpus/originals/: the files as received. Telegram Desktop copy-pastes and LinkedIn pastes as .md, .eml for emails and newsletters, .html or a URL for articles, .pdf, .png, .ogg voice notes, a .txt with a YouTube URL.</w:t>
       </w:r>
     </w:p>
     <w:p>
@@ -5141,9 +5450,8 @@
       </w:r>
     </w:p>
     <w:p>
-      <w:pPr/>
-      <w:r>
-        <w:t xml:space="preserve">Status on 19 October: six seeds import cleanly. Three are Telegram copies of an AI assistant's answers, one of them a near-duplicate of another sent 8 seconds later; one is an event agenda; one is a Russian channel repost; one is a LinkedIn Pulse article. uv run refresher-import eval/seed_corpus writes raw/*.json, --check fails when raw/ is stale, and uv run pytest covers the parsers and the corpus. The Telegram header names who sent the message, which goes to forwarded_by, not author_hint: the AI answers carry author "AI assistant", so the people they list become mentions, not authors.</w:t>
+      <w:r>
+        <w:t>Status on 19 October: six seeds import cleanly. Three are Telegram copies of an AI assistant's answers, one of them a near-duplicate of another sent 8 seconds later; one is an event agenda; one is a Russian channel repost; one is a LinkedIn Pulse article. uv run refresher-import eval/seed_corpus writes raw/*.json, --check fails when raw/ is stale, and uv run pytest covers the parsers and the corpus. The Telegram header names who sent the message, which goes to forwarded_by, not author_hint: the AI answers carry author "AI assistant", so the people they list become mentions, not authors.</w:t>
       </w:r>
     </w:p>
     <w:p>
@@ -5373,6 +5681,7 @@
           </w:tcPr>
           <w:p>
             <w:r>
+              <w:lastRenderedPageBreak/>
               <w:t>Images and scanned PDF pages</w:t>
             </w:r>
           </w:p>
@@ -5425,9 +5734,7 @@
           </w:tcPr>
           <w:p>
             <w:r>
-              <w:t xml:space="preserve">Token Factory hosts no speech model. CC BY 4.0, 25 European languages including Russian and </w:t>
-              <w:lastRenderedPageBreak/>
-              <w:t>Ukrainian; checked 18 October 2026</w:t>
+              <w:t>Token Factory hosts no speech model. CC BY 4.0, 25 European languages including Russian and Ukrainian; checked 18 October 2026</w:t>
             </w:r>
           </w:p>
         </w:tc>
@@ -5439,7 +5746,6 @@
           </w:tcPr>
           <w:p>
             <w:r>
-              <w:lastRenderedPageBreak/>
               <w:t>Graph database</w:t>
             </w:r>
           </w:p>
@@ -5675,7 +5981,9 @@
     </w:p>
     <w:p>
       <w:r>
-        <w:t>Three owners and one open workstream. Kirill owns the architecture and the schemas, email ingestion and the knowledge half-life, Olga owns ingestion, Victor owns the graphs, the Miro visualization and the people profiles. Kirill also owns the refresher, with /ask as a stretch. The MCP endpoint and the platform work have no owner yet and are decided at the next sync. Availability from the chat: Kirill works this weekend and Monday, travels three days mid next week, full time from the end of next week; Olga starts Monday 19 October at half days; Victor to confirm.</w:t>
+        <w:t xml:space="preserve">Three owners and one open workstream. Kirill owns the architecture and the schemas, email ingestion and the knowledge half-life, Olga owns ingestion, Victor owns the graphs, the Miro visualization and the people profiles. Kirill also owns the refresher, with /ask as a stretch. The MCP endpoint and the platform work have no owner yet and are decided at the next sync. Availability from the chat: Kirill works this </w:t>
+        <w:lastRenderedPageBreak/>
+        <w:t>weekend and Monday, travels three days mid next week, full time from the end of next week; Olga starts Monday 19 October at half days; Victor to confirm.</w:t>
       </w:r>
     </w:p>
     <w:tbl>
@@ -5702,7 +6010,6 @@
           </w:tcPr>
           <w:p>
             <w:r>
-              <w:lastRenderedPageBreak/>
               <w:t>Owner</w:t>
             </w:r>
           </w:p>
@@ -5874,6 +6181,7 @@
           </w:tcPr>
           <w:p>
             <w:r>
+              <w:lastRenderedPageBreak/>
               <w:t>Open</w:t>
             </w:r>
           </w:p>
@@ -5884,9 +6192,7 @@
           </w:tcPr>
           <w:p>
             <w:r>
-              <w:t xml:space="preserve">MCP and platform: MCP endpoint over the refresher's tools, Dockerfile, Serverless </w:t>
-              <w:lastRenderedPageBreak/>
-              <w:t>Endpoint and Job, demo page, video</w:t>
+              <w:t>MCP and platform: MCP endpoint over the refresher's tools, Dockerfile, Serverless Endpoint and Job, demo page, video</w:t>
             </w:r>
           </w:p>
         </w:tc>
@@ -5896,7 +6202,6 @@
           </w:tcPr>
           <w:p>
             <w:r>
-              <w:lastRenderedPageBreak/>
               <w:t>mcp/, deploy/, api/app.py, video</w:t>
             </w:r>
           </w:p>
@@ -5963,7 +6268,19 @@
         </w:numPr>
       </w:pPr>
       <w:r>
-        <w:t xml:space="preserve">The RawItem schema that every ingestion channel produces, Telegram, email or a future mobile app, in refresher/schemas.py (landed 19 October): channel, source_id, source_name, author_hint (who wrote it: name, handle, email, url), forwarded_by (who shared it with us, same fields), captured_at, published_at, url, kind (input shape for routing: text, link, file, image, voice, video), text, attachments (mime, path), schema_version. Unknown fields are rejected and timestamps must carry a timezone. content_hash is derived from the text and url for exact-duplicate checks; near-duplicates are the relation check's job.</w:t>
+        <w:t>The RawItem schema that every ingestion channel produces, Telegram, email or a future mobile app, in refresher/schemas.py (landed 19 October): channel, source_id, source_name, author_hint (who wrote it: name, handle, email, url), forwarded_by (who shared it with us, same fields), captured_at, published_at, url, kind (input shape for routing: text, link, file, image, voice, video), text, attachments (mime, path), schema_version. Unknown fields are rejected and timestamps must carry a timezone. content_hash is derived from the text and url for exact-duplicate checks; near-duplicates are the relation check's job.</w:t>
+      </w:r>
+    </w:p>
+    <w:p>
+      <w:pPr>
+        <w:pStyle w:val="ListParagraph"/>
+        <w:numPr>
+          <w:ilvl w:val="0"/>
+          <w:numId w:val="4"/>
+        </w:numPr>
+      </w:pPr>
+      <w:r>
+        <w:t xml:space="preserve">The Extraction record, ingestion's processed/&lt;item_id&gt;.json: source (the RawItem fields), sections, links, claims (claim_id, statement, kind, durability_class, half_life_days, confidence, evidence spans), entities (person, organization, concept), triage, reviews and quality_gate_passed. refresher/schemas.py reads it and ignores fields it does not use, so ingestion can add fields without breaking the graph or KM.</w:t>
       </w:r>
     </w:p>
     <w:p>
@@ -6541,6 +6858,30 @@
             <w:tcW w:w="4680" w:type="dxa"/>
           </w:tcPr>
           <w:p>
+            <w:pPr/>
+            <w:r>
+              <w:t xml:space="preserve">Olga's extractor calls Backboard with gpt-4o-mini, not Nebius Token Factory</w:t>
+            </w:r>
+          </w:p>
+        </w:tc>
+        <w:tc>
+          <w:tcPr>
+            <w:tcW w:w="4680" w:type="dxa"/>
+          </w:tcPr>
+          <w:p>
+            <w:pPr/>
+            <w:r>
+              <w:t xml:space="preserve">Point engine/llm.py at Token Factory with Nemotron Nano before the freeze; the hackathon judges the use of Nebius and NVIDIA models</w:t>
+            </w:r>
+          </w:p>
+        </w:tc>
+      </w:tr>
+      <w:tr>
+        <w:tc>
+          <w:tcPr>
+            <w:tcW w:w="4680" w:type="dxa"/>
+          </w:tcPr>
+          <w:p>
             <w:r>
               <w:t>Credits run out</w:t>
             </w:r>
@@ -6563,7 +6904,7 @@
       <w:footerReference w:type="even" r:id="rId26"/>
       <w:footerReference w:type="default" r:id="rId27"/>
       <w:pgSz w:w="12240" w:h="15840"/>
-      <w:pgMar w:top="208" w:right="1440" w:bottom="1440" w:left="1440" w:header="720" w:footer="720" w:gutter="0"/>
+      <w:pgMar w:top="194" w:right="1440" w:bottom="1440" w:left="1440" w:header="720" w:footer="720" w:gutter="0"/>
       <w:cols w:space="720"/>
     </w:sectPr>
   </w:body>

</xml_diff>

<commit_message>
Add --include-unreviewed; record the integration trial in the plan
refresher rebuild|km|eval --include-unreviewed places items whose quality
gate is needs_revision or pending, with an Unreviewed banner and
review_status in their notes and a "Placed without passing review"
section in health.md. Triage skips stay out. With it, the introspection
list is found as a repost of the people list on the real seeds.

Item titles skip the Telegram Desktop copy header. The committed seed
wikis are rebuilt with the flag. The v2 plan records the flag, the trial
findings and the Token Factory switch in the risks table.

Co-Authored-By: Claude Opus 5.5 <noreply@anthropic.com>
</commit_message>
<xml_diff>
--- a/Refresher hackathon plan and team split v2.docx
+++ b/Refresher hackathon plan and team split v2.docx
@@ -3733,7 +3733,7 @@
     <w:p>
       <w:pPr/>
       <w:r>
-        <w:t xml:space="preserve">uv run refresher rebuild replays processed/ and the overrides into the store, writes wiki/ and appends to log.md. Items that fail ingestion's quality gate or that triage skipped stay out of the graph and are listed as held back. The same processed files always give the same notes, byte for byte.</w:t>
+        <w:t xml:space="preserve">uv run refresher rebuild replays processed/ and the overrides into the store, writes wiki/ and appends to log.md. Items that fail ingestion's quality gate or that triage skipped stay out of the graph and are listed as held back. The same processed files always give the same notes, byte for byte. With --include-unreviewed, rebuild, km and eval also place items whose quality gate is needs_revision or pending; their notes carry an Unreviewed banner and review_status, and triage skips stay out. We use it for demos and relation checks until the gate settles.</w:t>
       </w:r>
     </w:p>
     <w:p>
@@ -3800,6 +3800,80 @@
       <w:pPr/>
       <w:r>
         <w:t xml:space="preserve">uv run refresher eval scores a built vault against the seed manifest's expected labels: author, kind, durability, claim count, people recall and precision, expected relations (the introspection list duplicates the people list; the synthetic correction supersedes the original), and supersession. Until Victor's relation check lands, the store uses a lexical baseline: near-identical text is a repost, the same claim from a different author is a confirmation; supersession and contradiction need his model check and show as misses.</w:t>
+      </w:r>
+    </w:p>
+    <w:p>
+      <w:pPr>
+        <w:pStyle w:val="Heading3"/>
+      </w:pPr>
+      <w:r>
+        <w:t xml:space="preserve">Integration trial, 20 October</w:t>
+      </w:r>
+    </w:p>
+    <w:p>
+      <w:pPr/>
+      <w:r>
+        <w:t xml:space="preserve">Branch kirill/integration-trial merges olga/ingestion into knowledge management and runs the nine seeds end to end on Token Factory. Findings and next steps for ingestion are in docs/integration-trial-2026-10-20.md; the two seed runs are committed under .local-vault/ (seed samples only; real captures stay ignored) and open with uv run refresher-view or in Obsidian.</w:t>
+      </w:r>
+    </w:p>
+    <w:p>
+      <w:pPr>
+        <w:pStyle w:val="ListParagraph"/>
+        <w:numPr>
+          <w:ilvl w:val="0"/>
+          <w:numId w:val="4"/>
+        </w:numPr>
+      </w:pPr>
+      <w:r>
+        <w:t xml:space="preserve">Models: Nemotron 3 Super for triage and extraction, Nemotron 3 Ultra for review, coverage and entities. Nano gave a third of the claims on long articles.</w:t>
+      </w:r>
+    </w:p>
+    <w:p>
+      <w:pPr>
+        <w:pStyle w:val="ListParagraph"/>
+        <w:numPr>
+          <w:ilvl w:val="0"/>
+          <w:numId w:val="4"/>
+        </w:numPr>
+      </w:pPr>
+      <w:r>
+        <w:t xml:space="preserve">Reviewers get short ids (C1…, E1…) instead of 64-character hashes; with long ids Ultra dropped characters and repeated or skipped items. Stored records keep the real ids.</w:t>
+      </w:r>
+    </w:p>
+    <w:p>
+      <w:pPr>
+        <w:pStyle w:val="ListParagraph"/>
+        <w:numPr>
+          <w:ilvl w:val="0"/>
+          <w:numId w:val="4"/>
+        </w:numPr>
+      </w:pPr>
+      <w:r>
+        <w:t xml:space="preserve">Validation failures now report both attempts' reasons and keep the rejected answers under rejected/ in the vault.</w:t>
+      </w:r>
+    </w:p>
+    <w:p>
+      <w:pPr>
+        <w:pStyle w:val="ListParagraph"/>
+        <w:numPr>
+          <w:ilvl w:val="0"/>
+          <w:numId w:val="4"/>
+        </w:numPr>
+      </w:pPr>
+      <w:r>
+        <w:t xml:space="preserve">Open for Olga: the quality gate passes only with zero omissions, so long and dense items never pass; proposal is to gate on claim correctness and record omissions as coverage notes, and to keep concept entities out of the gate.</w:t>
+      </w:r>
+    </w:p>
+    <w:p>
+      <w:pPr>
+        <w:pStyle w:val="ListParagraph"/>
+        <w:numPr>
+          <w:ilvl w:val="0"/>
+          <w:numId w:val="4"/>
+        </w:numPr>
+      </w:pPr>
+      <w:r>
+        <w:t xml:space="preserve">Seed eval: 17/33 checks with Super extraction, 23/33 with Nano before the short-id fix; most misses are triage kind and durability labels and relations between held-back items. With --include-unreviewed the introspection list is found as a repost of the people list.</w:t>
       </w:r>
     </w:p>
     <w:p>
@@ -6871,7 +6945,7 @@
           <w:p>
             <w:pPr/>
             <w:r>
-              <w:t xml:space="preserve">Point engine/llm.py at Token Factory with Nemotron Nano before the freeze; the hackathon judges the use of Nebius and NVIDIA models</w:t>
+              <w:t xml:space="preserve">Done on kirill/integration-trial: engine/llm.py calls Token Factory (Super for extraction, Ultra for review), Backboard stays optional. Needs Olga's review before it reaches main</w:t>
             </w:r>
           </w:p>
         </w:tc>

</xml_diff>

<commit_message>
Plan the last week for Victor and Kirill; add what is different
The v2 plan doc gets a "Plan from 23 October" section before Timeline:
the node and edge rules, Victor's graph work with a Neo4j go/no-go on
25 October, Kirill's store contract and refresher, handoffs and the
upstream gaps for Olga. What_is_different.md lists how Refresher differs.

Co-Authored-By: Claude Opus 5.5 <noreply@anthropic.com>
</commit_message>
<xml_diff>
--- a/Refresher hackathon plan and team split v2.docx
+++ b/Refresher hackathon plan and team split v2.docx
@@ -6372,6 +6372,632 @@
     <w:p>
       <w:r>
         <w:t>Shared across the team: README feedback section, filled whenever anyone hits a platform issue. Daily 15-minute sync in the chat; a call this weekend to confirm the split.</w:t>
+      </w:r>
+    </w:p>
+    <w:p>
+      <w:r>
+        <w:br w:type="page"/>
+      </w:r>
+    </w:p>
+    <w:p>
+      <w:pPr>
+        <w:pStyle w:val="Heading2"/>
+      </w:pPr>
+      <w:bookmarkStart w:id="90" w:name="_TocPlan23Oct"/>
+      <w:r>
+        <w:t xml:space="preserve">Plan from 23 October: graph and knowledge management</w:t>
+      </w:r>
+      <w:bookmarkEnd w:id="90"/>
+    </w:p>
+    <w:p>
+      <w:r>
+        <w:t xml:space="preserve">Olga continues on ingestion. This plan covers Victor and Kirill for the last week: code freeze Wednesday 28 October, submission Friday 30 October, 10:00 PT. Where we start: main has the in-memory graph (MemoryStore), scoring, vault views, the KM pass and the eval. There is no Neo4j code and no embeddings yet, and the relation check is lexical. On the Super seed run, 17 of 33 eval checks pass, and all three expected relations fail.</w:t>
+      </w:r>
+    </w:p>
+    <w:p>
+      <w:pPr>
+        <w:pStyle w:val="Heading3"/>
+      </w:pPr>
+      <w:r>
+        <w:t xml:space="preserve">Decisions this plan rests on</w:t>
+      </w:r>
+    </w:p>
+    <w:p>
+      <w:pPr>
+        <w:pStyle w:val="ListParagraph"/>
+        <w:numPr>
+          <w:ilvl w:val="0"/>
+          <w:numId w:val="4"/>
+        </w:numPr>
+      </w:pPr>
+      <w:r>
+        <w:rPr>
+          <w:b/>
+        </w:rPr>
+        <w:t xml:space="preserve">Person facts go to profiles.</w:t>
+      </w:r>
+      <w:r>
+        <w:t xml:space="preserve"> A claim whose subject is a person or organization becomes a profile entry on that node, not an Idea. About 90 of the 150 seed claims are of this kind; as Ideas they would make the graph a hairball.</w:t>
+      </w:r>
+    </w:p>
+    <w:p>
+      <w:pPr>
+        <w:pStyle w:val="ListParagraph"/>
+        <w:numPr>
+          <w:ilvl w:val="0"/>
+          <w:numId w:val="4"/>
+        </w:numPr>
+      </w:pPr>
+      <w:r>
+        <w:rPr>
+          <w:b/>
+        </w:rPr>
+        <w:t xml:space="preserve">What is a node.</w:t>
+      </w:r>
+      <w:r>
+        <w:t xml:space="preserve"> An Idea is the set of claims that make the same assertion. Ingest never creates Topics; the review creates one only from at least 3 Ideas from at least 2 independent sources. Concept entities stay tags.</w:t>
+      </w:r>
+    </w:p>
+    <w:p>
+      <w:pPr>
+        <w:pStyle w:val="ListParagraph"/>
+        <w:numPr>
+          <w:ilvl w:val="0"/>
+          <w:numId w:val="4"/>
+        </w:numPr>
+      </w:pPr>
+      <w:r>
+        <w:rPr>
+          <w:b/>
+        </w:rPr>
+        <w:t xml:space="preserve">Relation check.</w:t>
+      </w:r>
+      <w:r>
+        <w:t xml:space="preserve"> For each world claim, the top 5 candidate Ideas by embedding go to a judge that answers SAME, UPDATES, CONFLICTS, ADDS_DETAIL or NONE, with NONE as the default. The judge sees the whole item, so a correction's "previously 14:00" is read as a reference, not a confirmation.</w:t>
+      </w:r>
+    </w:p>
+    <w:p>
+      <w:pPr>
+        <w:pStyle w:val="ListParagraph"/>
+        <w:numPr>
+          <w:ilvl w:val="0"/>
+          <w:numId w:val="4"/>
+        </w:numPr>
+      </w:pPr>
+      <w:r>
+        <w:rPr>
+          <w:b/>
+        </w:rPr>
+        <w:t xml:space="preserve">Edge type is not the model's call.</w:t>
+      </w:r>
+      <w:r>
+        <w:t xml:space="preserve"> Provenance decides SUPPORTS versus DUPLICATES: SUPPORTS needs a different, independent author. Event time decides the direction of SUPERSEDES. The model decides neither.</w:t>
+      </w:r>
+    </w:p>
+    <w:p>
+      <w:pPr>
+        <w:pStyle w:val="ListParagraph"/>
+        <w:numPr>
+          <w:ilvl w:val="0"/>
+          <w:numId w:val="4"/>
+        </w:numPr>
+      </w:pPr>
+      <w:r>
+        <w:rPr>
+          <w:b/>
+        </w:rPr>
+        <w:t xml:space="preserve">Graph records, scoring judges.</w:t>
+      </w:r>
+      <w:r>
+        <w:t xml:space="preserve"> The graph writes edges with their event time and evidence. Half-life growth, clock reset and trust are computed by scoring at read time, so confirm() moves out of the graph's relation code.</w:t>
+      </w:r>
+    </w:p>
+    <w:p>
+      <w:pPr>
+        <w:pStyle w:val="ListParagraph"/>
+        <w:numPr>
+          <w:ilvl w:val="0"/>
+          <w:numId w:val="4"/>
+        </w:numPr>
+      </w:pPr>
+      <w:r>
+        <w:rPr>
+          <w:b/>
+        </w:rPr>
+        <w:t xml:space="preserve">Review verdicts are stored.</w:t>
+      </w:r>
+      <w:r>
+        <w:t xml:space="preserve"> Merges, item duplicates and Topics from the review are written to reviews/ in the vault, so a rebuild replays them instead of losing them.</w:t>
+      </w:r>
+    </w:p>
+    <w:p>
+      <w:pPr>
+        <w:pStyle w:val="ListParagraph"/>
+        <w:numPr>
+          <w:ilvl w:val="0"/>
+          <w:numId w:val="4"/>
+        </w:numPr>
+      </w:pPr>
+      <w:r>
+        <w:rPr>
+          <w:b/>
+        </w:rPr>
+        <w:t xml:space="preserve">Fallback.</w:t>
+      </w:r>
+      <w:r>
+        <w:t xml:space="preserve"> If the Neo4j store does not pass the shared replay tests by Sunday 25 October evening, the demo runs on MemoryStore and Neo4j moves to after the hackathon.</w:t>
+      </w:r>
+    </w:p>
+    <w:p>
+      <w:pPr>
+        <w:pStyle w:val="Heading3"/>
+      </w:pPr>
+      <w:r>
+        <w:t xml:space="preserve">Victor: graph building</w:t>
+      </w:r>
+    </w:p>
+    <w:tbl>
+      <w:tblPr>
+        <w:tblStyle w:val="TableGrid"/>
+        <w:tblW w:w="9360" w:type="dxa"/>
+        <w:tblLayout w:type="fixed"/>
+        <w:tblLook w:val="0420" w:firstRow="1" w:lastRow="0" w:firstColumn="0" w:lastColumn="0" w:noHBand="0" w:noVBand="1"/>
+      </w:tblPr>
+      <w:tblGrid>
+        <w:gridCol w:w="1500"/>
+        <w:gridCol w:w="4700"/>
+        <w:gridCol w:w="3160"/>
+      </w:tblGrid>
+      <w:tr>
+        <w:trPr>
+          <w:tblHeader/>
+        </w:trPr>
+        <w:tc>
+          <w:tcPr>
+            <w:tcW w:w="1500" w:type="dxa"/>
+            <w:shd w:val="clear" w:color="auto" w:fill="F2F2F2"/>
+          </w:tcPr>
+          <w:p>
+            <w:r>
+              <w:t xml:space="preserve">When</w:t>
+            </w:r>
+          </w:p>
+        </w:tc>
+        <w:tc>
+          <w:tcPr>
+            <w:tcW w:w="4700" w:type="dxa"/>
+            <w:shd w:val="clear" w:color="auto" w:fill="F2F2F2"/>
+          </w:tcPr>
+          <w:p>
+            <w:r>
+              <w:t xml:space="preserve">Work</w:t>
+            </w:r>
+          </w:p>
+        </w:tc>
+        <w:tc>
+          <w:tcPr>
+            <w:tcW w:w="3160" w:type="dxa"/>
+            <w:shd w:val="clear" w:color="auto" w:fill="F2F2F2"/>
+          </w:tcPr>
+          <w:p>
+            <w:r>
+              <w:t xml:space="preserve">Done when</w:t>
+            </w:r>
+          </w:p>
+        </w:tc>
+      </w:tr>
+      <w:tr>
+        <w:tc>
+          <w:tcPr>
+            <w:tcW w:w="1500" w:type="dxa"/>
+          </w:tcPr>
+          <w:p>
+            <w:r>
+              <w:t xml:space="preserve">Fri 23 – Sat 24</w:t>
+            </w:r>
+          </w:p>
+        </w:tc>
+        <w:tc>
+          <w:tcPr>
+            <w:tcW w:w="4700" w:type="dxa"/>
+          </w:tcPr>
+          <w:p>
+            <w:r>
+              <w:t xml:space="preserve">Neo4j store in Docker implementing GraphStore; replays the seed processed/ records. Claim embeddings (Qwen3 on Nebius) computed in graph.apply, with lexical candidates as the fallback.</w:t>
+            </w:r>
+          </w:p>
+        </w:tc>
+        <w:tc>
+          <w:tcPr>
+            <w:tcW w:w="3160" w:type="dxa"/>
+          </w:tcPr>
+          <w:p>
+            <w:r>
+              <w:t xml:space="preserve">The shared store tests pass on both MemoryStore and the Neo4j store.</w:t>
+            </w:r>
+          </w:p>
+        </w:tc>
+      </w:tr>
+      <w:tr>
+        <w:tc>
+          <w:tcPr>
+            <w:tcW w:w="1500" w:type="dxa"/>
+          </w:tcPr>
+          <w:p>
+            <w:r>
+              <w:t xml:space="preserve">Sat 24 – Mon 26</w:t>
+            </w:r>
+          </w:p>
+        </w:tc>
+        <w:tc>
+          <w:tcPr>
+            <w:tcW w:w="4700" w:type="dxa"/>
+          </w:tcPr>
+          <w:p>
+            <w:r>
+              <w:t xml:space="preserve">relate.py: routing of person and organization facts to profiles, top-5 candidates, the judge, and the provenance and time rules. Replaces MemoryStore._relate.</w:t>
+            </w:r>
+          </w:p>
+        </w:tc>
+        <w:tc>
+          <w:tcPr>
+            <w:tcW w:w="3160" w:type="dxa"/>
+          </w:tcPr>
+          <w:p>
+            <w:r>
+              <w:t xml:space="preserve">Seed relations pass: the two people lists, the repost and the correction. No SUPPORTS from the "previously" claim. Relation precision reported.</w:t>
+            </w:r>
+          </w:p>
+        </w:tc>
+      </w:tr>
+      <w:tr>
+        <w:tc>
+          <w:tcPr>
+            <w:tcW w:w="1500" w:type="dxa"/>
+          </w:tcPr>
+          <w:p>
+            <w:r>
+              <w:t xml:space="preserve">Mon 26 – Tue 27</w:t>
+            </w:r>
+          </w:p>
+        </w:tc>
+        <w:tc>
+          <w:tcPr>
+            <w:tcW w:w="4700" w:type="dxa"/>
+          </w:tcPr>
+          <w:p>
+            <w:r>
+              <w:t xml:space="preserve">review.py and graph.review(): item duplicates (70% of claims match), firming up provisional Ideas, merging Ideas, Topics, merging people; verdicts written to reviews/.</w:t>
+            </w:r>
+          </w:p>
+        </w:tc>
+        <w:tc>
+          <w:tcPr>
+            <w:tcW w:w="3160" w:type="dxa"/>
+          </w:tcPr>
+          <w:p>
+            <w:r>
+              <w:t xml:space="preserve">On the seed corpus: one item duplicate, zero Topics, and a rebuild reproduces both.</w:t>
+            </w:r>
+          </w:p>
+        </w:tc>
+      </w:tr>
+      <w:tr>
+        <w:tc>
+          <w:tcPr>
+            <w:tcW w:w="1500" w:type="dxa"/>
+          </w:tcPr>
+          <w:p>
+            <w:r>
+              <w:t xml:space="preserve">Tue 27, if time</w:t>
+            </w:r>
+          </w:p>
+        </w:tc>
+        <w:tc>
+          <w:tcPr>
+            <w:tcW w:w="4700" w:type="dxa"/>
+          </w:tcPr>
+          <w:p>
+            <w:r>
+              <w:t xml:space="preserve">Tavily enrichment, 3 searches per person (the Tavily bonus); Miro export. Splitting and re-attaching Ideas wait until after the hackathon.</w:t>
+            </w:r>
+          </w:p>
+        </w:tc>
+        <w:tc>
+          <w:tcPr>
+            <w:tcW w:w="3160" w:type="dxa"/>
+          </w:tcPr>
+          <w:p>
+            <w:r>
+              <w:t xml:space="preserve">One person in the demo enriched from Tavily, logged.</w:t>
+            </w:r>
+          </w:p>
+        </w:tc>
+      </w:tr>
+    </w:tbl>
+    <w:p>
+      <w:pPr>
+        <w:pStyle w:val="Heading3"/>
+      </w:pPr>
+      <w:r>
+        <w:t xml:space="preserve">Kirill: knowledge management and the refresher</w:t>
+      </w:r>
+    </w:p>
+    <w:tbl>
+      <w:tblPr>
+        <w:tblStyle w:val="TableGrid"/>
+        <w:tblW w:w="9360" w:type="dxa"/>
+        <w:tblLayout w:type="fixed"/>
+        <w:tblLook w:val="0420" w:firstRow="1" w:lastRow="0" w:firstColumn="0" w:lastColumn="0" w:noHBand="0" w:noVBand="1"/>
+      </w:tblPr>
+      <w:tblGrid>
+        <w:gridCol w:w="1500"/>
+        <w:gridCol w:w="4700"/>
+        <w:gridCol w:w="3160"/>
+      </w:tblGrid>
+      <w:tr>
+        <w:trPr>
+          <w:tblHeader/>
+        </w:trPr>
+        <w:tc>
+          <w:tcPr>
+            <w:tcW w:w="1500" w:type="dxa"/>
+            <w:shd w:val="clear" w:color="auto" w:fill="F2F2F2"/>
+          </w:tcPr>
+          <w:p>
+            <w:r>
+              <w:t xml:space="preserve">When</w:t>
+            </w:r>
+          </w:p>
+        </w:tc>
+        <w:tc>
+          <w:tcPr>
+            <w:tcW w:w="4700" w:type="dxa"/>
+            <w:shd w:val="clear" w:color="auto" w:fill="F2F2F2"/>
+          </w:tcPr>
+          <w:p>
+            <w:r>
+              <w:t xml:space="preserve">Work</w:t>
+            </w:r>
+          </w:p>
+        </w:tc>
+        <w:tc>
+          <w:tcPr>
+            <w:tcW w:w="3160" w:type="dxa"/>
+            <w:shd w:val="clear" w:color="auto" w:fill="F2F2F2"/>
+          </w:tcPr>
+          <w:p>
+            <w:r>
+              <w:t xml:space="preserve">Done when</w:t>
+            </w:r>
+          </w:p>
+        </w:tc>
+      </w:tr>
+      <w:tr>
+        <w:tc>
+          <w:tcPr>
+            <w:tcW w:w="1500" w:type="dxa"/>
+          </w:tcPr>
+          <w:p>
+            <w:r>
+              <w:t xml:space="preserve">Fri 23</w:t>
+            </w:r>
+          </w:p>
+        </w:tc>
+        <w:tc>
+          <w:tcPr>
+            <w:tcW w:w="4700" w:type="dxa"/>
+          </w:tcPr>
+          <w:p>
+            <w:r>
+              <w:t xml:space="preserve">Contract in graph/store.py: review() and ReviewReport, plus the graph.query functions the refresher needs (claims for a topic within two hops, supersession chain, people for a topic, item neighbours), stubbed in MemoryStore. Move confirm() and trust into scoring. Send the upstream gaps to Olga.</w:t>
+            </w:r>
+          </w:p>
+        </w:tc>
+        <w:tc>
+          <w:tcPr>
+            <w:tcW w:w="3160" w:type="dxa"/>
+          </w:tcPr>
+          <w:p>
+            <w:r>
+              <w:t xml:space="preserve">Victor can build against the contract on Saturday.</w:t>
+            </w:r>
+          </w:p>
+        </w:tc>
+      </w:tr>
+      <w:tr>
+        <w:tc>
+          <w:tcPr>
+            <w:tcW w:w="1500" w:type="dxa"/>
+          </w:tcPr>
+          <w:p>
+            <w:r>
+              <w:t xml:space="preserve">Sat 24 – Mon 26</w:t>
+            </w:r>
+          </w:p>
+        </w:tc>
+        <w:tc>
+          <w:tcPr>
+            <w:tcW w:w="4700" w:type="dxa"/>
+          </w:tcPr>
+          <w:p>
+            <w:r>
+              <w:t xml:space="preserve">The refresher: resolve, gather through graph.query, rank by relevance, freshness and trust with noise collapsed, sections (current, foundation, decayed and superseded chains, conflicts, people), write with Super, grade, deliver to wiki/refreshers and the bot's /refresh.</w:t>
+            </w:r>
+          </w:p>
+        </w:tc>
+        <w:tc>
+          <w:tcPr>
+            <w:tcW w:w="3160" w:type="dxa"/>
+          </w:tcPr>
+          <w:p>
+            <w:r>
+              <w:t xml:space="preserve">A refresher on the seed corpus cites claims and people, each with a string back to the raw item.</w:t>
+            </w:r>
+          </w:p>
+        </w:tc>
+      </w:tr>
+      <w:tr>
+        <w:tc>
+          <w:tcPr>
+            <w:tcW w:w="1500" w:type="dxa"/>
+          </w:tcPr>
+          <w:p>
+            <w:r>
+              <w:t xml:space="preserve">Tue 27</w:t>
+            </w:r>
+          </w:p>
+        </w:tc>
+        <w:tc>
+          <w:tcPr>
+            <w:tcW w:w="4700" w:type="dxa"/>
+          </w:tcPr>
+          <w:p>
+            <w:r>
+              <w:t xml:space="preserve">Eval table: seed checks, relation precision and recall, refresher grade. README with the llm-wiki-agent comparison. Health report at --at 2027-01-15.</w:t>
+            </w:r>
+          </w:p>
+        </w:tc>
+        <w:tc>
+          <w:tcPr>
+            <w:tcW w:w="3160" w:type="dxa"/>
+          </w:tcPr>
+          <w:p>
+            <w:r>
+              <w:t xml:space="preserve">The eval table is in the README.</w:t>
+            </w:r>
+          </w:p>
+        </w:tc>
+      </w:tr>
+      <w:tr>
+        <w:tc>
+          <w:tcPr>
+            <w:tcW w:w="1500" w:type="dxa"/>
+          </w:tcPr>
+          <w:p>
+            <w:r>
+              <w:t xml:space="preserve">Wed 28 – Thu 29</w:t>
+            </w:r>
+          </w:p>
+        </w:tc>
+        <w:tc>
+          <w:tcPr>
+            <w:tcW w:w="4700" w:type="dxa"/>
+          </w:tcPr>
+          <w:p>
+            <w:r>
+              <w:t xml:space="preserve">Freeze, demo run on the seed and a live forward, video. /ask is cut unless the refresher is done by Monday.</w:t>
+            </w:r>
+          </w:p>
+        </w:tc>
+        <w:tc>
+          <w:tcPr>
+            <w:tcW w:w="3160" w:type="dxa"/>
+          </w:tcPr>
+          <w:p>
+            <w:r>
+              <w:t xml:space="preserve">Video public, Devpost form submitted.</w:t>
+            </w:r>
+          </w:p>
+        </w:tc>
+      </w:tr>
+    </w:tbl>
+    <w:p>
+      <w:pPr>
+        <w:pStyle w:val="Heading3"/>
+      </w:pPr>
+      <w:r>
+        <w:t xml:space="preserve">Handoffs and open items</w:t>
+      </w:r>
+    </w:p>
+    <w:p>
+      <w:pPr>
+        <w:pStyle w:val="ListParagraph"/>
+        <w:numPr>
+          <w:ilvl w:val="0"/>
+          <w:numId w:val="4"/>
+        </w:numPr>
+      </w:pPr>
+      <w:r>
+        <w:rPr>
+          <w:b/>
+        </w:rPr>
+        <w:t xml:space="preserve">Fri 23.</w:t>
+      </w:r>
+      <w:r>
+        <w:t xml:space="preserve"> Kirill to Victor: the store contract and graph.query signatures.</w:t>
+      </w:r>
+    </w:p>
+    <w:p>
+      <w:pPr>
+        <w:pStyle w:val="ListParagraph"/>
+        <w:numPr>
+          <w:ilvl w:val="0"/>
+          <w:numId w:val="4"/>
+        </w:numPr>
+      </w:pPr>
+      <w:r>
+        <w:rPr>
+          <w:b/>
+        </w:rPr>
+        <w:t xml:space="preserve">Sun 25.</w:t>
+      </w:r>
+      <w:r>
+        <w:t xml:space="preserve"> Victor to Kirill: Neo4j go or no-go, and relate.py on the demo trio (original, repost, correction).</w:t>
+      </w:r>
+    </w:p>
+    <w:p>
+      <w:pPr>
+        <w:pStyle w:val="ListParagraph"/>
+        <w:numPr>
+          <w:ilvl w:val="0"/>
+          <w:numId w:val="4"/>
+        </w:numPr>
+      </w:pPr>
+      <w:r>
+        <w:rPr>
+          <w:b/>
+        </w:rPr>
+        <w:t xml:space="preserve">Tue 27.</w:t>
+      </w:r>
+      <w:r>
+        <w:t xml:space="preserve"> Victor to Kirill: the review is in, and the seed vault is rebuilt for the demo.</w:t>
+      </w:r>
+    </w:p>
+    <w:p>
+      <w:pPr>
+        <w:pStyle w:val="ListParagraph"/>
+        <w:numPr>
+          <w:ilvl w:val="0"/>
+          <w:numId w:val="4"/>
+        </w:numPr>
+      </w:pPr>
+      <w:r>
+        <w:rPr>
+          <w:b/>
+        </w:rPr>
+        <w:t xml:space="preserve">Upstream, for Olga:</w:t>
+      </w:r>
+      <w:r>
+        <w:t xml:space="preserve"> a subject field on each claim (person, organization or world); triage should keep a superseded original or let held-back items be SUPERSEDES targets; the forwarder should not be extracted as a mentioned person; "these economists" claims need their subject resolved.</w:t>
+      </w:r>
+    </w:p>
+    <w:p>
+      <w:pPr>
+        <w:pStyle w:val="ListParagraph"/>
+        <w:numPr>
+          <w:ilvl w:val="0"/>
+          <w:numId w:val="4"/>
+        </w:numPr>
+      </w:pPr>
+      <w:r>
+        <w:rPr>
+          <w:b/>
+        </w:rPr>
+        <w:t xml:space="preserve">Unowned:</w:t>
+      </w:r>
+      <w:r>
+        <w:t xml:space="preserve"> the MCP endpoint and deployment (Serverless Endpoint and Job) still have no owner. Decide at today's sync.</w:t>
       </w:r>
     </w:p>
     <w:p>

</xml_diff>

<commit_message>
Plan doc: the 26 October update on review proposals and Victor's map
Co-Authored-By: Claude Opus 5.5 <noreply@anthropic.com>
</commit_message>
<xml_diff>
--- a/Refresher hackathon plan and team split v2.docx
+++ b/Refresher hackathon plan and team split v2.docx
@@ -7009,6 +7009,74 @@
       </w:pPr>
       <w:r>
         <w:br w:type="page"/>
+      </w:r>
+    </w:p>
+    <w:p>
+      <w:pPr>
+        <w:pStyle w:val="Heading3"/>
+      </w:pPr>
+      <w:r>
+        <w:t>Update 26 October: the hourly review proposes, the user decides on Victor's map</w:t>
+      </w:r>
+    </w:p>
+    <w:p>
+      <w:pPr>
+        <w:pStyle w:val="ListParagraph"/>
+        <w:numPr>
+          <w:ilvl w:val="0"/>
+          <w:numId w:val="4"/>
+        </w:numPr>
+      </w:pPr>
+      <w:r>
+        <w:t>Victor's news map (PR #12) is a manual evidence ledger in SQLite; he confirmed the manual flow stands in until the model sets relations. We keep the vault as the only source of truth this week and port his viewer instead of his store; moving decisions into SQLite is an option after the freeze.</w:t>
+      </w:r>
+    </w:p>
+    <w:p>
+      <w:pPr>
+        <w:pStyle w:val="ListParagraph"/>
+        <w:numPr>
+          <w:ilvl w:val="0"/>
+          <w:numId w:val="4"/>
+        </w:numPr>
+      </w:pPr>
+      <w:r>
+        <w:t>Flow: ingest files each item automatically (bot reply). The hourly review (refresher consolidate, or /consolidate in the bot, or after a capture when the last run is over an hour old) re-judges relations that missed a later-arriving closer claim, applies item duplicates and firm Ideas, and proposes topics, Idea merges, people merges and confirmations of relations onto reference or foundation claims.</w:t>
+      </w:r>
+    </w:p>
+    <w:p>
+      <w:pPr>
+        <w:pStyle w:val="ListParagraph"/>
+        <w:numPr>
+          <w:ilvl w:val="0"/>
+          <w:numId w:val="4"/>
+        </w:numPr>
+      </w:pPr>
+      <w:r>
+        <w:t>The user decides proposals on the map (refresher serve, 127.0.0.1). Victor's stale token is kept: a proposal holds a fingerprint of the claims it covers, and a decision made on evidence that changed since is refused. Proposals and decisions live in graph-reviews/proposals/ and graph-reviews/decisions/.</w:t>
+      </w:r>
+    </w:p>
+    <w:p>
+      <w:pPr>
+        <w:pStyle w:val="ListParagraph"/>
+        <w:numPr>
+          <w:ilvl w:val="0"/>
+          <w:numId w:val="4"/>
+        </w:numPr>
+      </w:pPr>
+      <w:r>
+        <w:t>Topics: Ideas are embedded (offline word stems by default, NEBIUS_EMBED_MODEL for Nebius), linked to their 5 nearest neighbours above a threshold, and connected components of 3+ Ideas from 2+ sources become topic proposals, named by one model call each. An accepted topic takes close new Ideas provisionally at ingest.</w:t>
+      </w:r>
+    </w:p>
+    <w:p>
+      <w:pPr>
+        <w:pStyle w:val="ListParagraph"/>
+        <w:numPr>
+          <w:ilvl w:val="0"/>
+          <w:numId w:val="4"/>
+        </w:numPr>
+      </w:pPr>
+      <w:r>
+        <w:t>Victor's News Atlas viewer is the map (wiki/graph/index.html), in English: topics as regions, timeline, Sources and Claims modes, the exact passage behind each claim, side-by-side comparison, and a panel of proposals. Branch kirill/review-proposals; details in the README under 'The hourly review and your decisions'.</w:t>
       </w:r>
     </w:p>
     <w:p>

</xml_diff>

<commit_message>
The app and the hourly review as their own compose services
`frontend` becomes `app` (refresher serve, the one app), published on APP_PORT with that port allowed, since the
app takes changes only from its own address. A new `review` service runs `refresher consolidate --if-due --every
600`: every 10 minutes it reviews when the last run is an hour old and something was placed since.

The review stays on by default everywhere: the bot keeps reviewing too, and a run repeats its check under the vault
lock, so two runners never review twice. REFRESHER_REVIEW=off is only an opt-out. A scheduler (a Nebius serverless
job) runs `refresher consolidate --if-due` once per tick.

Co-Authored-By: Claude Opus 5.5 <noreply@anthropic.com>
</commit_message>
<xml_diff>
--- a/Refresher hackathon plan and team split v2.docx
+++ b/Refresher hackathon plan and team split v2.docx
@@ -7077,6 +7077,62 @@
       </w:pPr>
       <w:r>
         <w:t>Victor's News Atlas viewer is the map (wiki/graph/index.html), in English: topics as regions, timeline, Sources and Claims modes, the exact passage behind each claim, side-by-side comparison, and a panel of proposals. Branch kirill/review-proposals; details in the README under 'The hourly review and your decisions'.</w:t>
+      </w:r>
+    </w:p>
+    <w:p>
+      <w:pPr>
+        <w:pStyle w:val="Heading3"/>
+      </w:pPr>
+      <w:r>
+        <w:t>Update 28 October: one app, and the hourly review in its own container</w:t>
+      </w:r>
+    </w:p>
+    <w:p>
+      <w:pPr>
+        <w:pStyle w:val="ListParagraph"/>
+        <w:numPr>
+          <w:ilvl w:val="0"/>
+          <w:numId w:val="4"/>
+        </w:numPr>
+      </w:pPr>
+      <w:r>
+        <w:t xml:space="preserve">One app on one port: refresher serve (refresher/app.py) holds capture, the Atlas, topics at / and dossiers at /topic/, over the one vault the bot uses; web captures are placed the way the bot places them. In compose it is the app service (formerly frontend). APP_PORT publishes it on another port, and compose allows that port, because the app takes changes only from its own address.</w:t>
+      </w:r>
+    </w:p>
+    <w:p>
+      <w:pPr>
+        <w:pStyle w:val="ListParagraph"/>
+        <w:numPr>
+          <w:ilvl w:val="0"/>
+          <w:numId w:val="4"/>
+        </w:numPr>
+      </w:pPr>
+      <w:r>
+        <w:t xml:space="preserve">A new item shows at capture time and does not wait for the review: placement files its Ideas, puts them in clusters and lets them join accepted topics provisionally. The review firms Ideas up, applies duplicates and proposes topics and merges.</w:t>
+      </w:r>
+    </w:p>
+    <w:p>
+      <w:pPr>
+        <w:pStyle w:val="ListParagraph"/>
+        <w:numPr>
+          <w:ilvl w:val="0"/>
+          <w:numId w:val="4"/>
+        </w:numPr>
+      </w:pPr>
+      <w:r>
+        <w:t xml:space="preserve">The hourly review is on by default and has its own review service: refresher consolidate --if-due --every 600 checks every 10 minutes and runs when the last run is an hour old and something was placed since. The bot keeps reviewing too; a run repeats the check under the vault lock, so two runners never review twice. REFRESHER_REVIEW=off is only an opt-out.</w:t>
+      </w:r>
+    </w:p>
+    <w:p>
+      <w:pPr>
+        <w:pStyle w:val="ListParagraph"/>
+        <w:numPr>
+          <w:ilvl w:val="0"/>
+          <w:numId w:val="4"/>
+        </w:numPr>
+      </w:pPr>
+      <w:r>
+        <w:t xml:space="preserve">On Nebius serverless the review becomes a scheduled job that runs refresher consolidate --if-due once per tick. Open: the app, the bot and the job must share the vault on a filesystem with working POSIX locks (a shared filesystem, not object storage). Branch kirill/review-service.</w:t>
       </w:r>
     </w:p>
     <w:p>

</xml_diff>

<commit_message>
Plan v2: Update 29 October, the Context Engine and what a topic or query brief shows
Co-Authored-By: Claude Opus 5.5 <noreply@anthropic.com>
</commit_message>
<xml_diff>
--- a/Refresher hackathon plan and team split v2.docx
+++ b/Refresher hackathon plan and team split v2.docx
@@ -7133,6 +7133,134 @@
       </w:pPr>
       <w:r>
         <w:t xml:space="preserve">On Nebius serverless the review becomes a scheduled job that runs refresher consolidate --if-due once per tick. Open: the app, the bot and the job must share the vault on a filesystem with working POSIX locks (a shared filesystem, not object storage). Branch kirill/review-service.</w:t>
+      </w:r>
+    </w:p>
+    <w:p>
+      <w:pPr>
+        <w:pStyle w:val="Heading3"/>
+      </w:pPr>
+      <w:r>
+        <w:t>Update 29 October: the Context Engine, what a topic or query brief shows</w:t>
+      </w:r>
+    </w:p>
+    <w:p>
+      <w:pPr>
+        <w:pStyle w:val="ListParagraph"/>
+        <w:numPr>
+          <w:ilvl w:val="0"/>
+          <w:numId w:val="4"/>
+        </w:numPr>
+      </w:pPr>
+      <w:r>
+        <w:t xml:space="preserve">Why: three tries at the topic page (the dossier, the reading map, the Thread Navigator) stopped at the same wall: claims never related across sources. On the Telegram vault 221 of 222 claim verdicts were NONE and every Idea had one source, so nothing could tell a base from a rewrite.</w:t>
+      </w:r>
+    </w:p>
+    <w:p>
+      <w:pPr>
+        <w:pStyle w:val="ListParagraph"/>
+        <w:numPr>
+          <w:ilvl w:val="0"/>
+          <w:numId w:val="4"/>
+        </w:numPr>
+      </w:pPr>
+      <w:r>
+        <w:t xml:space="preserve">Granularity: thesis over claim. Each source gets one to three theses (what it argues, resting on its claims, with its stance: original, commentary, summary or retelling, and what it cites), stored in theses/. Relations are judged between theses across sources (same, builds on, updates, conflicts) in thesis-relations/. Claims stay the unit of evidence and decay. Both stages run in the hourly review; refresher theses and refresher relate-theses run them by hand.</w:t>
+      </w:r>
+    </w:p>
+    <w:p>
+      <w:pPr>
+        <w:pStyle w:val="ListParagraph"/>
+        <w:numPr>
+          <w:ilvl w:val="0"/>
+          <w:numId w:val="4"/>
+        </w:numPr>
+      </w:pPr>
+      <w:r>
+        <w:t xml:space="preserve">A major idea is a group of related theses. Inside it every source has a role: base (the one to read in depth), builder, rewrite (collapsed), superseded (a Previously line and a history of how the idea developed), or a source that only lends facts. Embeddings never merge theses: on Qwen3 related pairs scored 0.60 to 0.78 and unrelated ones on one subject up to 0.56.</w:t>
+      </w:r>
+    </w:p>
+    <w:p>
+      <w:pPr>
+        <w:pStyle w:val="ListParagraph"/>
+        <w:numPr>
+          <w:ilvl w:val="0"/>
+          <w:numId w:val="4"/>
+        </w:numPr>
+      </w:pPr>
+      <w:r>
+        <w:t xml:space="preserve">The brief writes one paragraph per major idea with the judge model; every sentence cites its sources ([S2], and [+S5] for a lent fact), and a sentence left without a valid citation is dropped.</w:t>
+      </w:r>
+    </w:p>
+    <w:p>
+      <w:pPr>
+        <w:pStyle w:val="ListParagraph"/>
+        <w:numPr>
+          <w:ilvl w:val="0"/>
+          <w:numId w:val="4"/>
+        </w:numPr>
+      </w:pPr>
+      <w:r>
+        <w:t xml:space="preserve">Authority: scored per major idea from the role a person or channel played (base, builder, superseded, rewrite) times their track record, plus credit from those who link, cite or quote them. It is summed by the query's relevance or by a cluster's share, so the brief and the cluster view agree. Reach, how often someone is named, is shown apart: a dozen mentions in rewrites weigh less than one credit from the writer of a base.</w:t>
+      </w:r>
+    </w:p>
+    <w:p>
+      <w:pPr>
+        <w:pStyle w:val="ListParagraph"/>
+        <w:numPr>
+          <w:ilvl w:val="0"/>
+          <w:numId w:val="4"/>
+        </w:numPr>
+      </w:pPr>
+      <w:r>
+        <w:t xml:space="preserve">Catch-up: a followed query is a thread. Stamping stores its brief in threads/ in the vault. The next brief opens on what arrived since the stamp, sorted into critical (it updates or contradicts what you knew, starts a new idea, becomes a new base, or is a new top voice), notes, and noise (rewrites, older views already replaced, only near the query).</w:t>
+      </w:r>
+    </w:p>
+    <w:p>
+      <w:pPr>
+        <w:pStyle w:val="ListParagraph"/>
+        <w:numPr>
+          <w:ilvl w:val="0"/>
+          <w:numId w:val="4"/>
+        </w:numPr>
+      </w:pPr>
+      <w:r>
+        <w:t xml:space="preserve">The page /brief/ (the home page's search and topics lead there, and the home page lists your threads) is one grid that narrows. Overview: the map (this area, the full graph with the brief's area lit, or the ideas) and the ideas with their summaries on the left; the details on the right, with the larger share: sources, people and organizations as badges, claims by kind, further reading and why.</w:t>
+      </w:r>
+    </w:p>
+    <w:p>
+      <w:pPr>
+        <w:pStyle w:val="ListParagraph"/>
+        <w:numPr>
+          <w:ilvl w:val="0"/>
+          <w:numId w:val="4"/>
+        </w:numPr>
+      </w:pPr>
+      <w:r>
+        <w:t xml:space="preserve">Opening a source narrows the same panels instead of replacing them: the brief becomes a rail (map, ideas with the ones this source serves marked here, sources), earlier sources of the path fold into vertical bars, the source shows as plain dense text, and the details stay full for that source, its claims grouped by what the brief takes. A claim lights its sentence on hover or click, and the details follow the text as it scrolls. Breadcrumbs show the path; Esc steps back. Sources, not Ideas, are the nodes of the map; an Idea is the reason two sources sit together.</w:t>
+      </w:r>
+    </w:p>
+    <w:p>
+      <w:pPr>
+        <w:pStyle w:val="ListParagraph"/>
+        <w:numPr>
+          <w:ilvl w:val="0"/>
+          <w:numId w:val="4"/>
+        </w:numPr>
+      </w:pPr>
+      <w:r>
+        <w:t xml:space="preserve">Atlas /read/: claim marks are off unless asked for, and a map tap while reading opens a peek instead of replacing the evidence. Victor to review.</w:t>
+      </w:r>
+    </w:p>
+    <w:p>
+      <w:pPr>
+        <w:pStyle w:val="ListParagraph"/>
+        <w:numPr>
+          <w:ilvl w:val="0"/>
+          <w:numId w:val="4"/>
+        </w:numPr>
+      </w:pPr>
+      <w:r>
+        <w:t xml:space="preserve">Status: PR #38 (kirill/context-engine, which also brings the reading map and the Thread Navigator, now the Sources tab). 650 tests, refresher eval-context 15/15 with every written sentence cited, seed eval 24/40 unchanged. Open: a dense test corpus (several sources on one story with a later update), the usability test, role badges in the Atlas, the bot's reply naming the thesis. Design and measurements in docs/plans/context-engine.md.</w:t>
       </w:r>
     </w:p>
     <w:p>

</xml_diff>